<commit_message>
Refine Chapter 5 rework presentation
</commit_message>
<xml_diff>
--- a/public/Chapter-5 Rework/Chapter_5_REWORK_Mecanisme_de_stress_version_clinique_Guy.docx
+++ b/public/Chapter-5 Rework/Chapter_5_REWORK_Mecanisme_de_stress_version_clinique_Guy.docx
@@ -152,7 +152,15 @@
                 <w:sz w:val="20"/>
                 <w:lang w:val="fr-FR"/>
               </w:rPr>
-              <w:t xml:space="preserve"> ; elle cherche, par un toucher mesuré, à soutenir la flexibilité autonome et la récupération, dans les limites des données disponibles.</w:t>
+              <w:t xml:space="preserve"> ; elle cherche, par un toucher mesuré, à soutenir la flexibilité autonome et la récupération</w:t>
+            </w:r>
+            <w:r>
+              <w:rPr>
+                <w:color w:val="2F3437"/>
+                <w:sz w:val="20"/>
+                <w:lang w:val="fr-FR"/>
+              </w:rPr>
+              <w:t>.</w:t>
             </w:r>
           </w:p>
         </w:tc>
@@ -4553,7 +4561,21 @@
           <w:rFonts w:ascii="Liberation Sans" w:eastAsia="Liberation Sans" w:hAnsi="Liberation Sans"/>
           <w:lang w:val="fr-FR"/>
         </w:rPr>
-        <w:t>17. Illustration clinique : fibromyalgie et charge allostatique</w:t>
+        <w:t xml:space="preserve">17. </w:t>
+      </w:r>
+      <w:r>
+        <w:rPr>
+          <w:rFonts w:ascii="Liberation Sans" w:eastAsia="Liberation Sans" w:hAnsi="Liberation Sans"/>
+          <w:lang w:val="fr-FR"/>
+        </w:rPr>
+        <w:t>Cas</w:t>
+      </w:r>
+      <w:r>
+        <w:rPr>
+          <w:rFonts w:ascii="Liberation Sans" w:eastAsia="Liberation Sans" w:hAnsi="Liberation Sans"/>
+          <w:lang w:val="fr-FR"/>
+        </w:rPr>
+        <w:t xml:space="preserve"> clinique : fibromyalgie et charge allostatique</w:t>
       </w:r>
     </w:p>
     <w:p>
@@ -5093,6 +5115,7 @@
       <w:pPr>
         <w:pStyle w:val="BodyText"/>
         <w:rPr>
+          <w:color w:val="2F3437"/>
           <w:lang w:val="fr-FR"/>
         </w:rPr>
       </w:pPr>
@@ -5103,23 +5126,40 @@
         </w:rPr>
         <w:t>Le pont le plus crédible avec la ROP reste la régulation de la réponse et de la récupération. Par une évaluation tissulaire, un toucher mesuré et une progression adaptée du niveau crânien au niveau viscéral, nous cherchons à apporter au système nerveux une information corporelle nouvelle, à diminuer une mobilisation devenue inutile et à favoriser le retour des fonctions respiratoires, digestives et restauratrices.</w:t>
       </w:r>
+    </w:p>
+    <w:p>
+      <w:pPr>
+        <w:pStyle w:val="BodyText"/>
+        <w:rPr>
+          <w:lang w:val="fr-FR"/>
+        </w:rPr>
+      </w:pPr>
     </w:p>
     <w:p>
       <w:pPr>
         <w:pStyle w:val="Quote"/>
         <w:jc w:val="center"/>
         <w:rPr>
-          <w:lang w:val="fr-FR"/>
-        </w:rPr>
-      </w:pPr>
-      <w:r>
-        <w:rPr>
           <w:color w:val="2C6B6F"/>
           <w:sz w:val="24"/>
           <w:lang w:val="fr-FR"/>
         </w:rPr>
+      </w:pPr>
+      <w:r>
+        <w:rPr>
+          <w:color w:val="2C6B6F"/>
+          <w:sz w:val="24"/>
+          <w:lang w:val="fr-FR"/>
+        </w:rPr>
         <w:t>En ROP, nous ne cherchons pas à empêcher l’organisme de réagir. Nous cherchons à l’aider à ne pas rester bloqué dans sa réaction.</w:t>
       </w:r>
+    </w:p>
+    <w:p>
+      <w:pPr>
+        <w:rPr>
+          <w:lang w:val="fr-FR"/>
+        </w:rPr>
+      </w:pPr>
     </w:p>
     <w:p>
       <w:pPr>
@@ -5217,7 +5257,56 @@
           <w:color w:val="2F3437"/>
           <w:lang w:val="fr-FR"/>
         </w:rPr>
-        <w:t>L’hypermétabolisme cellulaire observé in vitro ne peut pas être transposé directement à la dépense énergétique d’une personne.</w:t>
+        <w:t xml:space="preserve">L’hypermétabolisme cellulaire observé in vitro </w:t>
+      </w:r>
+      <w:r>
+        <w:rPr>
+          <w:color w:val="2F3437"/>
+          <w:lang w:val="fr-FR"/>
+        </w:rPr>
+        <w:t>pourrait permettre de comprendre</w:t>
+      </w:r>
+      <w:r>
+        <w:rPr>
+          <w:color w:val="2F3437"/>
+          <w:lang w:val="fr-FR"/>
+        </w:rPr>
+        <w:t xml:space="preserve"> la </w:t>
+      </w:r>
+      <w:r>
+        <w:rPr>
+          <w:color w:val="2F3437"/>
+          <w:lang w:val="fr-FR"/>
+        </w:rPr>
+        <w:t xml:space="preserve">réallocation de la </w:t>
+      </w:r>
+      <w:r>
+        <w:rPr>
+          <w:color w:val="2F3437"/>
+          <w:lang w:val="fr-FR"/>
+        </w:rPr>
+        <w:t>dépense énergétique d’une personne</w:t>
+      </w:r>
+      <w:r>
+        <w:rPr>
+          <w:color w:val="2F3437"/>
+          <w:lang w:val="fr-FR"/>
+        </w:rPr>
+        <w:t>, lors d’un é</w:t>
+      </w:r>
+      <w:r>
+        <w:rPr>
+          <w:color w:val="2F3437"/>
+          <w:lang w:val="fr-FR"/>
+        </w:rPr>
+        <w:t>p</w:t>
+      </w:r>
+      <w:r>
+        <w:rPr>
+          <w:color w:val="2F3437"/>
+          <w:lang w:val="fr-FR"/>
+        </w:rPr>
+        <w:t>isode de stress.</w:t>
       </w:r>
     </w:p>
     <w:p>
@@ -5265,7 +5354,63 @@
           <w:color w:val="2F3437"/>
           <w:lang w:val="fr-FR"/>
         </w:rPr>
-        <w:t>La ROP est surtout pertinente comme approche fonctionnelle et intégrative, dont les effets spécifiques restent à tester par des protocoles comparatifs.</w:t>
+        <w:t>La ROP est surtout pertinente comme approche fonctionnelle et intégrative</w:t>
+      </w:r>
+      <w:r>
+        <w:rPr>
+          <w:color w:val="2F3437"/>
+          <w:lang w:val="fr-FR"/>
+        </w:rPr>
+        <w:t>. L</w:t>
+      </w:r>
+      <w:r>
+        <w:rPr>
+          <w:color w:val="2F3437"/>
+          <w:lang w:val="fr-FR"/>
+        </w:rPr>
+        <w:t xml:space="preserve">es effets spécifiques </w:t>
+      </w:r>
+      <w:r>
+        <w:rPr>
+          <w:color w:val="2F3437"/>
+          <w:lang w:val="fr-FR"/>
+        </w:rPr>
+        <w:t>observés en clini</w:t>
+      </w:r>
+      <w:r>
+        <w:rPr>
+          <w:color w:val="2F3437"/>
+          <w:lang w:val="fr-FR"/>
+        </w:rPr>
+        <w:t>qu</w:t>
+      </w:r>
+      <w:r>
+        <w:rPr>
+          <w:color w:val="2F3437"/>
+          <w:lang w:val="fr-FR"/>
+        </w:rPr>
+        <w:t>e doivent maintenant être mesurés</w:t>
+      </w:r>
+      <w:r>
+        <w:rPr>
+          <w:color w:val="2F3437"/>
+          <w:lang w:val="fr-FR"/>
+        </w:rPr>
+        <w:t xml:space="preserve"> </w:t>
+      </w:r>
+      <w:r>
+        <w:rPr>
+          <w:color w:val="2F3437"/>
+          <w:lang w:val="fr-FR"/>
+        </w:rPr>
+        <w:t xml:space="preserve">scientifiquement via des </w:t>
+      </w:r>
+      <w:r>
+        <w:rPr>
+          <w:color w:val="2F3437"/>
+          <w:lang w:val="fr-FR"/>
+        </w:rPr>
+        <w:t>protocoles comparatifs.</w:t>
       </w:r>
     </w:p>
     <w:p>
@@ -5326,15 +5471,519 @@
     <w:p>
       <w:pPr>
         <w:pStyle w:val="BodyText"/>
+        <w:numPr>
+          <w:ilvl w:val="0"/>
+          <w:numId w:val="18"/>
+        </w:numPr>
         <w:spacing w:after="60"/>
-        <w:ind w:left="312" w:hanging="312"/>
-      </w:pPr>
-      <w:r>
         <w:rPr>
           <w:color w:val="2F3437"/>
           <w:sz w:val="18"/>
         </w:rPr>
-        <w:t>1. McEwen BS. Physiology and neurobiology of stress and adaptation: central role of the brain. Physiological Reviews. 2007;87(3):873-904. doi:10.1152/physrev.00041.2006.</w:t>
+      </w:pPr>
+      <w:r>
+        <w:rPr>
+          <w:color w:val="2F3437"/>
+          <w:sz w:val="18"/>
+        </w:rPr>
+        <w:t xml:space="preserve">McEwen BS. Physiology and neurobiology of stress and adaptation: central role of the brain. </w:t>
+      </w:r>
+      <w:r>
+        <w:rPr>
+          <w:i/>
+          <w:iCs/>
+          <w:color w:val="2F3437"/>
+          <w:sz w:val="18"/>
+        </w:rPr>
+        <w:t>Physiological Reviews</w:t>
+      </w:r>
+      <w:r>
+        <w:rPr>
+          <w:color w:val="2F3437"/>
+          <w:sz w:val="18"/>
+        </w:rPr>
+        <w:t xml:space="preserve">. 2007;87(3):873–904. doi:10.1152/physrev.00041.2006. </w:t>
+      </w:r>
+    </w:p>
+    <w:p>
+      <w:pPr>
+        <w:pStyle w:val="BodyText"/>
+        <w:numPr>
+          <w:ilvl w:val="0"/>
+          <w:numId w:val="18"/>
+        </w:numPr>
+        <w:spacing w:after="60"/>
+        <w:rPr>
+          <w:color w:val="2F3437"/>
+          <w:sz w:val="18"/>
+        </w:rPr>
+      </w:pPr>
+      <w:r>
+        <w:rPr>
+          <w:color w:val="2F3437"/>
+          <w:sz w:val="18"/>
+        </w:rPr>
+        <w:t xml:space="preserve">Bobba-Alves N, Juster RP, Picard M. The energetic cost of allostasis and allostatic load. </w:t>
+      </w:r>
+      <w:proofErr w:type="spellStart"/>
+      <w:r>
+        <w:rPr>
+          <w:i/>
+          <w:iCs/>
+          <w:color w:val="2F3437"/>
+          <w:sz w:val="18"/>
+        </w:rPr>
+        <w:t>Psychoneuroendocrinology</w:t>
+      </w:r>
+      <w:proofErr w:type="spellEnd"/>
+      <w:r>
+        <w:rPr>
+          <w:color w:val="2F3437"/>
+          <w:sz w:val="18"/>
+        </w:rPr>
+        <w:t xml:space="preserve">. </w:t>
+      </w:r>
+      <w:proofErr w:type="gramStart"/>
+      <w:r>
+        <w:rPr>
+          <w:color w:val="2F3437"/>
+          <w:sz w:val="18"/>
+        </w:rPr>
+        <w:t>2022;146:105951</w:t>
+      </w:r>
+      <w:proofErr w:type="gramEnd"/>
+      <w:r>
+        <w:rPr>
+          <w:color w:val="2F3437"/>
+          <w:sz w:val="18"/>
+        </w:rPr>
+        <w:t xml:space="preserve">. </w:t>
+      </w:r>
+      <w:proofErr w:type="gramStart"/>
+      <w:r>
+        <w:rPr>
+          <w:color w:val="2F3437"/>
+          <w:sz w:val="18"/>
+        </w:rPr>
+        <w:t>doi:10.1016/j.psyneuen</w:t>
+      </w:r>
+      <w:proofErr w:type="gramEnd"/>
+      <w:r>
+        <w:rPr>
+          <w:color w:val="2F3437"/>
+          <w:sz w:val="18"/>
+        </w:rPr>
+        <w:t xml:space="preserve">.2022.105951. </w:t>
+      </w:r>
+    </w:p>
+    <w:p>
+      <w:pPr>
+        <w:pStyle w:val="BodyText"/>
+        <w:numPr>
+          <w:ilvl w:val="0"/>
+          <w:numId w:val="18"/>
+        </w:numPr>
+        <w:spacing w:after="60"/>
+        <w:rPr>
+          <w:color w:val="2F3437"/>
+          <w:sz w:val="18"/>
+        </w:rPr>
+      </w:pPr>
+      <w:r>
+        <w:rPr>
+          <w:color w:val="2F3437"/>
+          <w:sz w:val="18"/>
+        </w:rPr>
+        <w:t xml:space="preserve">Bobba-Alves N, Sturm G, Lin J, Ware SA, Karan KR, Monzel AS, et al. Cellular allostatic load is linked to increased energy expenditure and accelerated biological aging. </w:t>
+      </w:r>
+      <w:proofErr w:type="spellStart"/>
+      <w:r>
+        <w:rPr>
+          <w:i/>
+          <w:iCs/>
+          <w:color w:val="2F3437"/>
+          <w:sz w:val="18"/>
+        </w:rPr>
+        <w:t>Psychoneuroendocrinology</w:t>
+      </w:r>
+      <w:proofErr w:type="spellEnd"/>
+      <w:r>
+        <w:rPr>
+          <w:color w:val="2F3437"/>
+          <w:sz w:val="18"/>
+        </w:rPr>
+        <w:t xml:space="preserve">. </w:t>
+      </w:r>
+      <w:proofErr w:type="gramStart"/>
+      <w:r>
+        <w:rPr>
+          <w:color w:val="2F3437"/>
+          <w:sz w:val="18"/>
+        </w:rPr>
+        <w:t>2023;155:106322</w:t>
+      </w:r>
+      <w:proofErr w:type="gramEnd"/>
+      <w:r>
+        <w:rPr>
+          <w:color w:val="2F3437"/>
+          <w:sz w:val="18"/>
+        </w:rPr>
+        <w:t xml:space="preserve">. </w:t>
+      </w:r>
+      <w:proofErr w:type="gramStart"/>
+      <w:r>
+        <w:rPr>
+          <w:color w:val="2F3437"/>
+          <w:sz w:val="18"/>
+        </w:rPr>
+        <w:t>doi:10.1016/j.psyneuen</w:t>
+      </w:r>
+      <w:proofErr w:type="gramEnd"/>
+      <w:r>
+        <w:rPr>
+          <w:color w:val="2F3437"/>
+          <w:sz w:val="18"/>
+        </w:rPr>
+        <w:t xml:space="preserve">.2023.106322. </w:t>
+      </w:r>
+    </w:p>
+    <w:p>
+      <w:pPr>
+        <w:pStyle w:val="BodyText"/>
+        <w:numPr>
+          <w:ilvl w:val="0"/>
+          <w:numId w:val="18"/>
+        </w:numPr>
+        <w:spacing w:after="60"/>
+        <w:rPr>
+          <w:color w:val="2F3437"/>
+          <w:sz w:val="18"/>
+        </w:rPr>
+      </w:pPr>
+      <w:r>
+        <w:rPr>
+          <w:color w:val="2F3437"/>
+          <w:sz w:val="18"/>
+        </w:rPr>
+        <w:t xml:space="preserve">Picard M, Murugan NJ. The energy resistance principle. </w:t>
+      </w:r>
+      <w:r>
+        <w:rPr>
+          <w:i/>
+          <w:iCs/>
+          <w:color w:val="2F3437"/>
+          <w:sz w:val="18"/>
+        </w:rPr>
+        <w:t>Cell Metabolism</w:t>
+      </w:r>
+      <w:r>
+        <w:rPr>
+          <w:color w:val="2F3437"/>
+          <w:sz w:val="18"/>
+        </w:rPr>
+        <w:t xml:space="preserve">. 2025;37(11):2107–2127. </w:t>
+      </w:r>
+      <w:proofErr w:type="gramStart"/>
+      <w:r>
+        <w:rPr>
+          <w:color w:val="2F3437"/>
+          <w:sz w:val="18"/>
+        </w:rPr>
+        <w:t>doi:10.1016/j.cmet</w:t>
+      </w:r>
+      <w:proofErr w:type="gramEnd"/>
+      <w:r>
+        <w:rPr>
+          <w:color w:val="2F3437"/>
+          <w:sz w:val="18"/>
+        </w:rPr>
+        <w:t xml:space="preserve">.2025.09.002. </w:t>
+      </w:r>
+    </w:p>
+    <w:p>
+      <w:pPr>
+        <w:pStyle w:val="BodyText"/>
+        <w:numPr>
+          <w:ilvl w:val="0"/>
+          <w:numId w:val="18"/>
+        </w:numPr>
+        <w:spacing w:after="60"/>
+        <w:rPr>
+          <w:color w:val="2F3437"/>
+          <w:sz w:val="18"/>
+        </w:rPr>
+      </w:pPr>
+      <w:r>
+        <w:rPr>
+          <w:color w:val="2F3437"/>
+          <w:sz w:val="18"/>
+        </w:rPr>
+        <w:t xml:space="preserve">Descamps E, Boussac M, </w:t>
+      </w:r>
+      <w:proofErr w:type="spellStart"/>
+      <w:r>
+        <w:rPr>
+          <w:color w:val="2F3437"/>
+          <w:sz w:val="18"/>
+        </w:rPr>
+        <w:t>Joineau</w:t>
+      </w:r>
+      <w:proofErr w:type="spellEnd"/>
+      <w:r>
+        <w:rPr>
+          <w:color w:val="2F3437"/>
+          <w:sz w:val="18"/>
+        </w:rPr>
+        <w:t xml:space="preserve"> K, </w:t>
+      </w:r>
+      <w:proofErr w:type="spellStart"/>
+      <w:r>
+        <w:rPr>
+          <w:color w:val="2F3437"/>
+          <w:sz w:val="18"/>
+        </w:rPr>
+        <w:t>Payoux</w:t>
+      </w:r>
+      <w:proofErr w:type="spellEnd"/>
+      <w:r>
+        <w:rPr>
+          <w:color w:val="2F3437"/>
+          <w:sz w:val="18"/>
+        </w:rPr>
+        <w:t xml:space="preserve"> P. Changes of cerebral functional connectivity induced by foot reflexology in a RCT. </w:t>
+      </w:r>
+      <w:r>
+        <w:rPr>
+          <w:i/>
+          <w:iCs/>
+          <w:color w:val="2F3437"/>
+          <w:sz w:val="18"/>
+        </w:rPr>
+        <w:t>Scientific Reports</w:t>
+      </w:r>
+      <w:r>
+        <w:rPr>
+          <w:color w:val="2F3437"/>
+          <w:sz w:val="18"/>
+        </w:rPr>
+        <w:t xml:space="preserve">. 2023;13(1):17139. doi:10.1038/s41598-023-44325-x. </w:t>
+      </w:r>
+    </w:p>
+    <w:p>
+      <w:pPr>
+        <w:pStyle w:val="BodyText"/>
+        <w:numPr>
+          <w:ilvl w:val="0"/>
+          <w:numId w:val="18"/>
+        </w:numPr>
+        <w:spacing w:after="60"/>
+        <w:rPr>
+          <w:color w:val="2F3437"/>
+          <w:sz w:val="18"/>
+        </w:rPr>
+      </w:pPr>
+      <w:r>
+        <w:rPr>
+          <w:color w:val="2F3437"/>
+          <w:sz w:val="18"/>
+        </w:rPr>
+        <w:t xml:space="preserve">Khalsa SS, Adolphs R, Cameron OG, Critchley HD, Davenport PW, Feinstein JS, et al. Interoception and mental health: a roadmap. </w:t>
+      </w:r>
+      <w:r>
+        <w:rPr>
+          <w:i/>
+          <w:iCs/>
+          <w:color w:val="2F3437"/>
+          <w:sz w:val="18"/>
+        </w:rPr>
+        <w:t>Biological Psychiatry: Cognitive Neuroscience and Neuroimaging</w:t>
+      </w:r>
+      <w:r>
+        <w:rPr>
+          <w:color w:val="2F3437"/>
+          <w:sz w:val="18"/>
+        </w:rPr>
+        <w:t xml:space="preserve">. 2018;3(6):501–513. </w:t>
+      </w:r>
+      <w:proofErr w:type="gramStart"/>
+      <w:r>
+        <w:rPr>
+          <w:color w:val="2F3437"/>
+          <w:sz w:val="18"/>
+        </w:rPr>
+        <w:t>doi:10.1016/j.bpsc</w:t>
+      </w:r>
+      <w:proofErr w:type="gramEnd"/>
+      <w:r>
+        <w:rPr>
+          <w:color w:val="2F3437"/>
+          <w:sz w:val="18"/>
+        </w:rPr>
+        <w:t xml:space="preserve">.2017.12.004. </w:t>
+      </w:r>
+    </w:p>
+    <w:p>
+      <w:pPr>
+        <w:pStyle w:val="BodyText"/>
+        <w:numPr>
+          <w:ilvl w:val="0"/>
+          <w:numId w:val="18"/>
+        </w:numPr>
+        <w:spacing w:after="60"/>
+        <w:rPr>
+          <w:color w:val="2F3437"/>
+          <w:sz w:val="18"/>
+        </w:rPr>
+      </w:pPr>
+      <w:r>
+        <w:rPr>
+          <w:color w:val="2F3437"/>
+          <w:sz w:val="18"/>
+        </w:rPr>
+        <w:t xml:space="preserve">Chen WG, Schloesser D, Arensdorf AM, Simmons JM, Cui C, Valentino R, et al. The emerging science of interoception: sensing, integrating, interpreting, and regulating signals within the self. </w:t>
+      </w:r>
+      <w:r>
+        <w:rPr>
+          <w:i/>
+          <w:iCs/>
+          <w:color w:val="2F3437"/>
+          <w:sz w:val="18"/>
+        </w:rPr>
+        <w:t>Trends in Neurosciences</w:t>
+      </w:r>
+      <w:r>
+        <w:rPr>
+          <w:color w:val="2F3437"/>
+          <w:sz w:val="18"/>
+        </w:rPr>
+        <w:t xml:space="preserve">. 2021;44(1):3–16. </w:t>
+      </w:r>
+      <w:proofErr w:type="gramStart"/>
+      <w:r>
+        <w:rPr>
+          <w:color w:val="2F3437"/>
+          <w:sz w:val="18"/>
+        </w:rPr>
+        <w:t>doi:10.1016/j.tins</w:t>
+      </w:r>
+      <w:proofErr w:type="gramEnd"/>
+      <w:r>
+        <w:rPr>
+          <w:color w:val="2F3437"/>
+          <w:sz w:val="18"/>
+        </w:rPr>
+        <w:t xml:space="preserve">.2020.10.007. </w:t>
+      </w:r>
+    </w:p>
+    <w:p>
+      <w:pPr>
+        <w:pStyle w:val="BodyText"/>
+        <w:numPr>
+          <w:ilvl w:val="0"/>
+          <w:numId w:val="18"/>
+        </w:numPr>
+        <w:spacing w:after="60"/>
+        <w:rPr>
+          <w:color w:val="2F3437"/>
+          <w:sz w:val="18"/>
+        </w:rPr>
+      </w:pPr>
+      <w:r>
+        <w:rPr>
+          <w:color w:val="2F3437"/>
+          <w:sz w:val="18"/>
+        </w:rPr>
+        <w:t xml:space="preserve">Hopper SI, Murray SL, Ferrara LR, Singleton JK. Effectiveness of diaphragmatic breathing for reducing physiological and psychological stress in adults: a quantitative systematic review. </w:t>
+      </w:r>
+      <w:r>
+        <w:rPr>
+          <w:i/>
+          <w:iCs/>
+          <w:color w:val="2F3437"/>
+          <w:sz w:val="18"/>
+        </w:rPr>
+        <w:t>JBI Database of Systematic Reviews and Implementation Reports</w:t>
+      </w:r>
+      <w:r>
+        <w:rPr>
+          <w:color w:val="2F3437"/>
+          <w:sz w:val="18"/>
+        </w:rPr>
+        <w:t xml:space="preserve">. 2019;17(9):1855–1876. doi:10.11124/JBISRIR-2017-003848. </w:t>
+      </w:r>
+    </w:p>
+    <w:p>
+      <w:pPr>
+        <w:pStyle w:val="BodyText"/>
+        <w:numPr>
+          <w:ilvl w:val="0"/>
+          <w:numId w:val="18"/>
+        </w:numPr>
+        <w:spacing w:after="60"/>
+        <w:rPr>
+          <w:color w:val="2F3437"/>
+          <w:sz w:val="18"/>
+        </w:rPr>
+      </w:pPr>
+      <w:r>
+        <w:rPr>
+          <w:color w:val="2F3437"/>
+          <w:sz w:val="18"/>
+        </w:rPr>
+        <w:t xml:space="preserve">Cannon WB. </w:t>
+      </w:r>
+      <w:r>
+        <w:rPr>
+          <w:i/>
+          <w:iCs/>
+          <w:color w:val="2F3437"/>
+          <w:sz w:val="18"/>
+        </w:rPr>
+        <w:t>The Wisdom of the Body</w:t>
+      </w:r>
+      <w:r>
+        <w:rPr>
+          <w:color w:val="2F3437"/>
+          <w:sz w:val="18"/>
+        </w:rPr>
+        <w:t xml:space="preserve">. New York: W.W. Norton &amp; Company; 1932. </w:t>
+      </w:r>
+    </w:p>
+    <w:p>
+      <w:pPr>
+        <w:pStyle w:val="BodyText"/>
+        <w:numPr>
+          <w:ilvl w:val="0"/>
+          <w:numId w:val="18"/>
+        </w:numPr>
+        <w:spacing w:after="60"/>
+        <w:rPr>
+          <w:color w:val="2F3437"/>
+          <w:sz w:val="18"/>
+        </w:rPr>
+      </w:pPr>
+      <w:r>
+        <w:rPr>
+          <w:color w:val="2F3437"/>
+          <w:sz w:val="18"/>
+        </w:rPr>
+        <w:t xml:space="preserve">Selye H. </w:t>
+      </w:r>
+      <w:r>
+        <w:rPr>
+          <w:i/>
+          <w:iCs/>
+          <w:color w:val="2F3437"/>
+          <w:sz w:val="18"/>
+        </w:rPr>
+        <w:t>The Stress of Life</w:t>
+      </w:r>
+      <w:r>
+        <w:rPr>
+          <w:color w:val="2F3437"/>
+          <w:sz w:val="18"/>
+        </w:rPr>
+        <w:t>. New York: McGraw-Hill; 1956.</w:t>
       </w:r>
     </w:p>
     <w:p>
@@ -5342,233 +5991,49 @@
         <w:pStyle w:val="BodyText"/>
         <w:spacing w:after="60"/>
         <w:ind w:left="312" w:hanging="312"/>
-      </w:pPr>
-      <w:r>
         <w:rPr>
           <w:color w:val="2F3437"/>
           <w:sz w:val="18"/>
         </w:rPr>
-        <w:t>2. Bobba-Alves N, Juster RP, Picard M. The energetic cost of allostasis and allostatic load. Psychoneuroendocrinology. 2022;146:105951. doi:10.1016/j.psyneuen.2022.105951.</w:t>
+      </w:pPr>
+    </w:p>
+    <w:p>
+      <w:pPr>
+        <w:pStyle w:val="Heading1"/>
+        <w:rPr>
+          <w:rFonts w:ascii="Liberation Sans" w:eastAsia="Liberation Sans" w:hAnsi="Liberation Sans"/>
+        </w:rPr>
+      </w:pPr>
+      <w:proofErr w:type="spellStart"/>
+      <w:r>
+        <w:rPr>
+          <w:rFonts w:ascii="Liberation Sans" w:eastAsia="Liberation Sans" w:hAnsi="Liberation Sans"/>
+        </w:rPr>
+        <w:t>Annexe</w:t>
+      </w:r>
+      <w:proofErr w:type="spellEnd"/>
+      <w:r>
+        <w:rPr>
+          <w:rFonts w:ascii="Liberation Sans" w:eastAsia="Liberation Sans" w:hAnsi="Liberation Sans"/>
+        </w:rPr>
+        <w:t xml:space="preserve"> 1</w:t>
       </w:r>
     </w:p>
     <w:p>
       <w:pPr>
         <w:pStyle w:val="BodyText"/>
-        <w:spacing w:after="60"/>
-        <w:ind w:left="312" w:hanging="312"/>
-      </w:pPr>
-      <w:r>
-        <w:rPr>
-          <w:color w:val="2F3437"/>
-          <w:sz w:val="18"/>
-        </w:rPr>
-        <w:t>3. Bobba-Alves N, et al. Cellular allostatic load is linked to increased energy expenditure and accelerated biological aging. Psychoneuroendocrinology. 2023;155:106322. doi:10.1016/j.psyneuen.2023.106322.</w:t>
-      </w:r>
-    </w:p>
-    <w:p>
-      <w:pPr>
-        <w:pStyle w:val="BodyText"/>
-        <w:spacing w:after="60"/>
-        <w:ind w:left="312" w:hanging="312"/>
-      </w:pPr>
-      <w:r>
-        <w:rPr>
-          <w:color w:val="2F3437"/>
-          <w:sz w:val="18"/>
-        </w:rPr>
-        <w:t>4. Picard M, Murugan NJ. The energy resistance principle. Cell Metabolism. 2025;37. doi:10.1016/j.cmet.2025.09.002.</w:t>
-      </w:r>
-    </w:p>
-    <w:p>
-      <w:pPr>
-        <w:pStyle w:val="BodyText"/>
-        <w:spacing w:after="60"/>
-        <w:ind w:left="312" w:hanging="312"/>
-      </w:pPr>
-      <w:r>
-        <w:rPr>
-          <w:color w:val="2F3437"/>
-          <w:sz w:val="18"/>
-          <w:lang w:val="fr-FR"/>
-        </w:rPr>
-        <w:t xml:space="preserve">5. Descamps E, Boussac M, Joineau K, et al. </w:t>
-      </w:r>
-      <w:r>
-        <w:rPr>
-          <w:color w:val="2F3437"/>
-          <w:sz w:val="18"/>
-        </w:rPr>
-        <w:t>Changes of cerebral functional connectivity induced by foot reflexology in a randomized controlled trial. Scientific Reports. 2023;13:17139. doi:10.1038/s41598-023-44325-x.</w:t>
-      </w:r>
-    </w:p>
-    <w:p>
-      <w:pPr>
-        <w:pStyle w:val="BodyText"/>
-        <w:spacing w:after="60"/>
-        <w:ind w:left="312" w:hanging="312"/>
-      </w:pPr>
-      <w:r>
-        <w:rPr>
-          <w:color w:val="2F3437"/>
-          <w:sz w:val="18"/>
-        </w:rPr>
-        <w:t>6. Khalsa SS, et al. Interoception and mental health: a roadmap. Biological Psychiatry: Cognitive Neuroscience and Neuroimaging. 2018;3(6):501-513. doi:10.1016/j.bpsc.2017.12.004.</w:t>
-      </w:r>
-    </w:p>
-    <w:p>
-      <w:pPr>
-        <w:pStyle w:val="BodyText"/>
-        <w:spacing w:after="60"/>
-        <w:ind w:left="312" w:hanging="312"/>
-        <w:rPr>
-          <w:lang w:val="fr-FR"/>
-        </w:rPr>
-      </w:pPr>
-      <w:r>
-        <w:rPr>
-          <w:color w:val="2F3437"/>
-          <w:sz w:val="18"/>
-        </w:rPr>
-        <w:t xml:space="preserve">7. Chen WG, et al. The emerging science of interoception: sensing, integrating, interpreting, and regulating signals within the self. </w:t>
-      </w:r>
-      <w:r>
-        <w:rPr>
-          <w:color w:val="2F3437"/>
-          <w:sz w:val="18"/>
-          <w:lang w:val="fr-FR"/>
-        </w:rPr>
-        <w:t xml:space="preserve">Trends in Neurosciences. </w:t>
-      </w:r>
-      <w:proofErr w:type="gramStart"/>
-      <w:r>
-        <w:rPr>
-          <w:color w:val="2F3437"/>
-          <w:sz w:val="18"/>
-          <w:lang w:val="fr-FR"/>
-        </w:rPr>
-        <w:t>2021;</w:t>
-      </w:r>
-      <w:proofErr w:type="gramEnd"/>
-      <w:r>
-        <w:rPr>
-          <w:color w:val="2F3437"/>
-          <w:sz w:val="18"/>
-          <w:lang w:val="fr-FR"/>
-        </w:rPr>
-        <w:t>44(1</w:t>
-      </w:r>
-      <w:proofErr w:type="gramStart"/>
-      <w:r>
-        <w:rPr>
-          <w:color w:val="2F3437"/>
-          <w:sz w:val="18"/>
-          <w:lang w:val="fr-FR"/>
-        </w:rPr>
-        <w:t>):</w:t>
-      </w:r>
-      <w:proofErr w:type="gramEnd"/>
-      <w:r>
-        <w:rPr>
-          <w:color w:val="2F3437"/>
-          <w:sz w:val="18"/>
-          <w:lang w:val="fr-FR"/>
-        </w:rPr>
-        <w:t xml:space="preserve">3-16. </w:t>
-      </w:r>
-      <w:proofErr w:type="gramStart"/>
-      <w:r>
-        <w:rPr>
-          <w:color w:val="2F3437"/>
-          <w:sz w:val="18"/>
-          <w:lang w:val="fr-FR"/>
-        </w:rPr>
-        <w:t>doi:10.1016/j.tins</w:t>
-      </w:r>
-      <w:proofErr w:type="gramEnd"/>
-      <w:r>
-        <w:rPr>
-          <w:color w:val="2F3437"/>
-          <w:sz w:val="18"/>
-          <w:lang w:val="fr-FR"/>
-        </w:rPr>
-        <w:t>.2020.10.007.</w:t>
-      </w:r>
-    </w:p>
-    <w:p>
-      <w:pPr>
-        <w:pStyle w:val="BodyText"/>
-        <w:spacing w:after="60"/>
-        <w:ind w:left="312" w:hanging="312"/>
-      </w:pPr>
-      <w:r>
-        <w:rPr>
-          <w:color w:val="2F3437"/>
-          <w:sz w:val="18"/>
-          <w:lang w:val="fr-FR"/>
-        </w:rPr>
-        <w:t xml:space="preserve">8. Hopper SI, et al. </w:t>
-      </w:r>
-      <w:r>
-        <w:rPr>
-          <w:color w:val="2F3437"/>
-          <w:sz w:val="18"/>
-        </w:rPr>
-        <w:t>Effectiveness of diaphragmatic breathing for reducing physiological and psychological stress in adults: a quantitative systematic review. JBI Database of Systematic Reviews and Implementation Reports. 2019;17(9):1855-1876. doi:10.11124/JBISRIR-2017-003848.</w:t>
-      </w:r>
-    </w:p>
-    <w:p>
-      <w:pPr>
-        <w:pStyle w:val="BodyText"/>
-        <w:spacing w:after="60"/>
-        <w:ind w:left="312" w:hanging="312"/>
-      </w:pPr>
-      <w:r>
-        <w:rPr>
-          <w:color w:val="2F3437"/>
-          <w:sz w:val="18"/>
-        </w:rPr>
-        <w:t>9. Cannon WB. The Wisdom of the Body. New York: W.W. Norton; 1932.</w:t>
-      </w:r>
-    </w:p>
-    <w:p>
-      <w:pPr>
-        <w:pStyle w:val="BodyText"/>
-        <w:spacing w:after="60"/>
-        <w:ind w:left="312" w:hanging="312"/>
-        <w:rPr>
-          <w:color w:val="2F3437"/>
-          <w:sz w:val="18"/>
-        </w:rPr>
-      </w:pPr>
-      <w:r>
-        <w:rPr>
-          <w:color w:val="2F3437"/>
-          <w:sz w:val="18"/>
-        </w:rPr>
-        <w:t>10. Selye H. The Stress of Life. New York: McGraw-Hill; 1956.</w:t>
-      </w:r>
-    </w:p>
-    <w:p>
-      <w:pPr>
-        <w:pStyle w:val="BodyText"/>
-        <w:spacing w:after="60"/>
-        <w:ind w:left="312" w:hanging="312"/>
-        <w:rPr>
-          <w:color w:val="2F3437"/>
-          <w:sz w:val="18"/>
-        </w:rPr>
-      </w:pPr>
-    </w:p>
-    <w:p>
-      <w:pPr>
-        <w:pStyle w:val="BodyText"/>
-        <w:spacing w:after="60"/>
-        <w:ind w:left="312" w:hanging="312"/>
-        <w:rPr>
-          <w:color w:val="2F3437"/>
-          <w:sz w:val="18"/>
-        </w:rPr>
-      </w:pPr>
+        <w:rPr>
+          <w:color w:val="2F3437"/>
+          <w:lang w:val="fr-FR"/>
+        </w:rPr>
+      </w:pPr>
+      <w:r>
+        <w:rPr>
+          <w:color w:val="2F3437"/>
+          <w:lang w:val="fr-FR"/>
+        </w:rPr>
+        <w:t>La réponse SAM constitue le versant rapide du mécanisme de stress. L’hypothalamus et le tronc cérébral recrutent en quelques secondes les voies sympathiques et les circuits noradrénergiques. La médullosurrénale libère de l’adrénaline et de la noradrénaline : le cœur, la respiration, la pression artérielle et la disponibilité du glucose s’ajustent pour préparer l’action. Si la contrainte cesse, l’activation se retire progressivement ; si elle persiste, l’axe HHS complète et prolonge l’adaptation.</w:t>
+      </w:r>
     </w:p>
     <w:p>
       <w:pPr>
@@ -5578,74 +6043,12 @@
           <w:lang w:val="fr-FR"/>
         </w:rPr>
       </w:pPr>
-      <w:proofErr w:type="spellStart"/>
       <w:r>
         <w:rPr>
           <w:rFonts w:ascii="Liberation Sans" w:eastAsia="Liberation Sans" w:hAnsi="Liberation Sans"/>
           <w:lang w:val="fr-FR"/>
         </w:rPr>
-        <w:t>Annexe</w:t>
-      </w:r>
-      <w:proofErr w:type="spellEnd"/>
-      <w:r>
-        <w:rPr>
-          <w:rFonts w:ascii="Liberation Sans" w:eastAsia="Liberation Sans" w:hAnsi="Liberation Sans"/>
-          <w:lang w:val="fr-FR"/>
-        </w:rPr>
-        <w:t xml:space="preserve"> 1</w:t>
-      </w:r>
-    </w:p>
-    <w:p>
-      <w:pPr>
-        <w:pStyle w:val="BodyText"/>
-        <w:rPr>
-          <w:color w:val="2F3437"/>
-          <w:lang w:val="fr-FR"/>
-        </w:rPr>
-      </w:pPr>
-      <w:r>
-        <w:rPr>
-          <w:color w:val="2F3437"/>
-          <w:lang w:val="fr-FR"/>
-        </w:rPr>
-        <w:t>La réponse SAM constitue le versant rapide du mécanisme de stress. L’hypothalamus et le tronc cérébral recrutent en quelques</w:t>
-      </w:r>
-      <w:r>
-        <w:rPr>
-          <w:color w:val="2F3437"/>
-          <w:lang w:val="fr-FR"/>
-        </w:rPr>
-        <w:t xml:space="preserve"> </w:t>
-      </w:r>
-      <w:r>
-        <w:rPr>
-          <w:color w:val="2F3437"/>
-          <w:lang w:val="fr-FR"/>
-        </w:rPr>
-        <w:t>secondes les voies sympathiques et les circuits noradrénergiques. La médullosurrénale libère de l’adrénaline et de la noradrénaline : le cœur, la respiration, la pression artérielle et la disponibilité du glucose s’ajustent pour préparer l’action. Si la contrainte cesse, l’activation se retire progressivement ; si elle persiste, l’axe HHS complète et prolonge l’adaptation.</w:t>
-      </w:r>
-    </w:p>
-    <w:p>
-      <w:pPr>
-        <w:pStyle w:val="Heading1"/>
-        <w:rPr>
-          <w:rFonts w:ascii="Liberation Sans" w:eastAsia="Liberation Sans" w:hAnsi="Liberation Sans"/>
-          <w:lang w:val="fr-FR"/>
-        </w:rPr>
-      </w:pPr>
-      <w:r>
-        <w:rPr>
-          <w:rFonts w:ascii="Liberation Sans" w:eastAsia="Liberation Sans" w:hAnsi="Liberation Sans"/>
-          <w:lang w:val="fr-FR"/>
-        </w:rPr>
-        <w:t xml:space="preserve">Annexe </w:t>
-      </w:r>
-      <w:r>
-        <w:rPr>
-          <w:rFonts w:ascii="Liberation Sans" w:eastAsia="Liberation Sans" w:hAnsi="Liberation Sans"/>
-          <w:lang w:val="fr-FR"/>
-        </w:rPr>
-        <w:t>2</w:t>
+        <w:t>Annexe 2</w:t>
       </w:r>
     </w:p>
     <w:p>
@@ -7539,6 +7942,92 @@
     </w:lvl>
   </w:abstractNum>
   <w:abstractNum w:abstractNumId="14" w15:restartNumberingAfterBreak="0">
+    <w:nsid w:val="607D5AB3"/>
+    <w:multiLevelType w:val="hybridMultilevel"/>
+    <w:tmpl w:val="8E5A7C36"/>
+    <w:lvl w:ilvl="0" w:tplc="0409000F">
+      <w:start w:val="1"/>
+      <w:numFmt w:val="decimal"/>
+      <w:lvlText w:val="%1."/>
+      <w:lvlJc w:val="left"/>
+      <w:pPr>
+        <w:ind w:left="720" w:hanging="360"/>
+      </w:pPr>
+    </w:lvl>
+    <w:lvl w:ilvl="1" w:tplc="04090019" w:tentative="1">
+      <w:start w:val="1"/>
+      <w:numFmt w:val="lowerLetter"/>
+      <w:lvlText w:val="%2."/>
+      <w:lvlJc w:val="left"/>
+      <w:pPr>
+        <w:ind w:left="1440" w:hanging="360"/>
+      </w:pPr>
+    </w:lvl>
+    <w:lvl w:ilvl="2" w:tplc="0409001B" w:tentative="1">
+      <w:start w:val="1"/>
+      <w:numFmt w:val="lowerRoman"/>
+      <w:lvlText w:val="%3."/>
+      <w:lvlJc w:val="right"/>
+      <w:pPr>
+        <w:ind w:left="2160" w:hanging="180"/>
+      </w:pPr>
+    </w:lvl>
+    <w:lvl w:ilvl="3" w:tplc="0409000F" w:tentative="1">
+      <w:start w:val="1"/>
+      <w:numFmt w:val="decimal"/>
+      <w:lvlText w:val="%4."/>
+      <w:lvlJc w:val="left"/>
+      <w:pPr>
+        <w:ind w:left="2880" w:hanging="360"/>
+      </w:pPr>
+    </w:lvl>
+    <w:lvl w:ilvl="4" w:tplc="04090019" w:tentative="1">
+      <w:start w:val="1"/>
+      <w:numFmt w:val="lowerLetter"/>
+      <w:lvlText w:val="%5."/>
+      <w:lvlJc w:val="left"/>
+      <w:pPr>
+        <w:ind w:left="3600" w:hanging="360"/>
+      </w:pPr>
+    </w:lvl>
+    <w:lvl w:ilvl="5" w:tplc="0409001B" w:tentative="1">
+      <w:start w:val="1"/>
+      <w:numFmt w:val="lowerRoman"/>
+      <w:lvlText w:val="%6."/>
+      <w:lvlJc w:val="right"/>
+      <w:pPr>
+        <w:ind w:left="4320" w:hanging="180"/>
+      </w:pPr>
+    </w:lvl>
+    <w:lvl w:ilvl="6" w:tplc="0409000F" w:tentative="1">
+      <w:start w:val="1"/>
+      <w:numFmt w:val="decimal"/>
+      <w:lvlText w:val="%7."/>
+      <w:lvlJc w:val="left"/>
+      <w:pPr>
+        <w:ind w:left="5040" w:hanging="360"/>
+      </w:pPr>
+    </w:lvl>
+    <w:lvl w:ilvl="7" w:tplc="04090019" w:tentative="1">
+      <w:start w:val="1"/>
+      <w:numFmt w:val="lowerLetter"/>
+      <w:lvlText w:val="%8."/>
+      <w:lvlJc w:val="left"/>
+      <w:pPr>
+        <w:ind w:left="5760" w:hanging="360"/>
+      </w:pPr>
+    </w:lvl>
+    <w:lvl w:ilvl="8" w:tplc="0409001B" w:tentative="1">
+      <w:start w:val="1"/>
+      <w:numFmt w:val="lowerRoman"/>
+      <w:lvlText w:val="%9."/>
+      <w:lvlJc w:val="right"/>
+      <w:pPr>
+        <w:ind w:left="6480" w:hanging="180"/>
+      </w:pPr>
+    </w:lvl>
+  </w:abstractNum>
+  <w:abstractNum w:abstractNumId="15" w15:restartNumberingAfterBreak="0">
     <w:nsid w:val="646710A7"/>
     <w:multiLevelType w:val="multilevel"/>
     <w:tmpl w:val="316C8862"/>
@@ -7687,7 +8176,7 @@
       </w:rPr>
     </w:lvl>
   </w:abstractNum>
-  <w:abstractNum w:abstractNumId="15" w15:restartNumberingAfterBreak="0">
+  <w:abstractNum w:abstractNumId="16" w15:restartNumberingAfterBreak="0">
     <w:nsid w:val="6BC944BD"/>
     <w:multiLevelType w:val="multilevel"/>
     <w:tmpl w:val="B1E8C22E"/>
@@ -7836,7 +8325,7 @@
       </w:rPr>
     </w:lvl>
   </w:abstractNum>
-  <w:abstractNum w:abstractNumId="16" w15:restartNumberingAfterBreak="0">
+  <w:abstractNum w:abstractNumId="17" w15:restartNumberingAfterBreak="0">
     <w:nsid w:val="753F4715"/>
     <w:multiLevelType w:val="multilevel"/>
     <w:tmpl w:val="8960BC96"/>
@@ -8019,13 +8508,13 @@
     <w:abstractNumId w:val="9"/>
   </w:num>
   <w:num w:numId="12" w16cid:durableId="1322277151">
-    <w:abstractNumId w:val="14"/>
+    <w:abstractNumId w:val="15"/>
   </w:num>
   <w:num w:numId="13" w16cid:durableId="574629319">
     <w:abstractNumId w:val="11"/>
   </w:num>
   <w:num w:numId="14" w16cid:durableId="491989213">
-    <w:abstractNumId w:val="16"/>
+    <w:abstractNumId w:val="17"/>
   </w:num>
   <w:num w:numId="15" w16cid:durableId="101148653">
     <w:abstractNumId w:val="12"/>
@@ -8034,7 +8523,10 @@
     <w:abstractNumId w:val="13"/>
   </w:num>
   <w:num w:numId="17" w16cid:durableId="2100785731">
-    <w:abstractNumId w:val="15"/>
+    <w:abstractNumId w:val="16"/>
+  </w:num>
+  <w:num w:numId="18" w16cid:durableId="1656953289">
+    <w:abstractNumId w:val="14"/>
   </w:num>
 </w:numbering>
 </file>

</xml_diff>

<commit_message>
Add Chapter 5 rework reflex zones
</commit_message>
<xml_diff>
--- a/public/Chapter-5 Rework/Chapter_5_REWORK_Mecanisme_de_stress_version_clinique_Guy.docx
+++ b/public/Chapter-5 Rework/Chapter_5_REWORK_Mecanisme_de_stress_version_clinique_Guy.docx
@@ -152,15 +152,7 @@
                 <w:sz w:val="20"/>
                 <w:lang w:val="fr-FR"/>
               </w:rPr>
-              <w:t xml:space="preserve"> ; elle cherche, par un toucher mesuré, à soutenir la flexibilité autonome et la récupération</w:t>
-            </w:r>
-            <w:r>
-              <w:rPr>
-                <w:color w:val="2F3437"/>
-                <w:sz w:val="20"/>
-                <w:lang w:val="fr-FR"/>
-              </w:rPr>
-              <w:t>.</w:t>
+              <w:t xml:space="preserve"> ; elle cherche, par un toucher mesuré, à soutenir la flexibilité autonome et la récupération, dans les limites des données disponibles.</w:t>
             </w:r>
           </w:p>
         </w:tc>
@@ -4561,21 +4553,7 @@
           <w:rFonts w:ascii="Liberation Sans" w:eastAsia="Liberation Sans" w:hAnsi="Liberation Sans"/>
           <w:lang w:val="fr-FR"/>
         </w:rPr>
-        <w:t xml:space="preserve">17. </w:t>
-      </w:r>
-      <w:r>
-        <w:rPr>
-          <w:rFonts w:ascii="Liberation Sans" w:eastAsia="Liberation Sans" w:hAnsi="Liberation Sans"/>
-          <w:lang w:val="fr-FR"/>
-        </w:rPr>
-        <w:t>Cas</w:t>
-      </w:r>
-      <w:r>
-        <w:rPr>
-          <w:rFonts w:ascii="Liberation Sans" w:eastAsia="Liberation Sans" w:hAnsi="Liberation Sans"/>
-          <w:lang w:val="fr-FR"/>
-        </w:rPr>
-        <w:t xml:space="preserve"> clinique : fibromyalgie et charge allostatique</w:t>
+        <w:t>17. Illustration clinique : fibromyalgie et charge allostatique</w:t>
       </w:r>
     </w:p>
     <w:p>
@@ -5115,7 +5093,6 @@
       <w:pPr>
         <w:pStyle w:val="BodyText"/>
         <w:rPr>
-          <w:color w:val="2F3437"/>
           <w:lang w:val="fr-FR"/>
         </w:rPr>
       </w:pPr>
@@ -5126,40 +5103,23 @@
         </w:rPr>
         <w:t>Le pont le plus crédible avec la ROP reste la régulation de la réponse et de la récupération. Par une évaluation tissulaire, un toucher mesuré et une progression adaptée du niveau crânien au niveau viscéral, nous cherchons à apporter au système nerveux une information corporelle nouvelle, à diminuer une mobilisation devenue inutile et à favoriser le retour des fonctions respiratoires, digestives et restauratrices.</w:t>
       </w:r>
-    </w:p>
-    <w:p>
-      <w:pPr>
-        <w:pStyle w:val="BodyText"/>
-        <w:rPr>
-          <w:lang w:val="fr-FR"/>
-        </w:rPr>
-      </w:pPr>
     </w:p>
     <w:p>
       <w:pPr>
         <w:pStyle w:val="Quote"/>
         <w:jc w:val="center"/>
         <w:rPr>
+          <w:lang w:val="fr-FR"/>
+        </w:rPr>
+      </w:pPr>
+      <w:r>
+        <w:rPr>
           <w:color w:val="2C6B6F"/>
           <w:sz w:val="24"/>
           <w:lang w:val="fr-FR"/>
         </w:rPr>
-      </w:pPr>
-      <w:r>
-        <w:rPr>
-          <w:color w:val="2C6B6F"/>
-          <w:sz w:val="24"/>
-          <w:lang w:val="fr-FR"/>
-        </w:rPr>
         <w:t>En ROP, nous ne cherchons pas à empêcher l’organisme de réagir. Nous cherchons à l’aider à ne pas rester bloqué dans sa réaction.</w:t>
       </w:r>
-    </w:p>
-    <w:p>
-      <w:pPr>
-        <w:rPr>
-          <w:lang w:val="fr-FR"/>
-        </w:rPr>
-      </w:pPr>
     </w:p>
     <w:p>
       <w:pPr>
@@ -5257,56 +5217,7 @@
           <w:color w:val="2F3437"/>
           <w:lang w:val="fr-FR"/>
         </w:rPr>
-        <w:t xml:space="preserve">L’hypermétabolisme cellulaire observé in vitro </w:t>
-      </w:r>
-      <w:r>
-        <w:rPr>
-          <w:color w:val="2F3437"/>
-          <w:lang w:val="fr-FR"/>
-        </w:rPr>
-        <w:t>pourrait permettre de comprendre</w:t>
-      </w:r>
-      <w:r>
-        <w:rPr>
-          <w:color w:val="2F3437"/>
-          <w:lang w:val="fr-FR"/>
-        </w:rPr>
-        <w:t xml:space="preserve"> la </w:t>
-      </w:r>
-      <w:r>
-        <w:rPr>
-          <w:color w:val="2F3437"/>
-          <w:lang w:val="fr-FR"/>
-        </w:rPr>
-        <w:t xml:space="preserve">réallocation de la </w:t>
-      </w:r>
-      <w:r>
-        <w:rPr>
-          <w:color w:val="2F3437"/>
-          <w:lang w:val="fr-FR"/>
-        </w:rPr>
-        <w:t>dépense énergétique d’une personne</w:t>
-      </w:r>
-      <w:r>
-        <w:rPr>
-          <w:color w:val="2F3437"/>
-          <w:lang w:val="fr-FR"/>
-        </w:rPr>
-        <w:t>, lors d’un é</w:t>
-      </w:r>
-      <w:r>
-        <w:rPr>
-          <w:color w:val="2F3437"/>
-          <w:lang w:val="fr-FR"/>
-        </w:rPr>
-        <w:t>p</w:t>
-      </w:r>
-      <w:r>
-        <w:rPr>
-          <w:color w:val="2F3437"/>
-          <w:lang w:val="fr-FR"/>
-        </w:rPr>
-        <w:t>isode de stress.</w:t>
+        <w:t>L’hypermétabolisme cellulaire observé in vitro ne peut pas être transposé directement à la dépense énergétique d’une personne.</w:t>
       </w:r>
     </w:p>
     <w:p>
@@ -5354,77 +5265,7 @@
           <w:color w:val="2F3437"/>
           <w:lang w:val="fr-FR"/>
         </w:rPr>
-        <w:t>La ROP est surtout pertinente comme approche fonctionnelle et intégrative</w:t>
-      </w:r>
-      <w:r>
-        <w:rPr>
-          <w:color w:val="2F3437"/>
-          <w:lang w:val="fr-FR"/>
-        </w:rPr>
-        <w:t>. L</w:t>
-      </w:r>
-      <w:r>
-        <w:rPr>
-          <w:color w:val="2F3437"/>
-          <w:lang w:val="fr-FR"/>
-        </w:rPr>
-        <w:t xml:space="preserve">es effets spécifiques </w:t>
-      </w:r>
-      <w:r>
-        <w:rPr>
-          <w:color w:val="2F3437"/>
-          <w:lang w:val="fr-FR"/>
-        </w:rPr>
-        <w:t>observés en clini</w:t>
-      </w:r>
-      <w:r>
-        <w:rPr>
-          <w:color w:val="2F3437"/>
-          <w:lang w:val="fr-FR"/>
-        </w:rPr>
-        <w:t>qu</w:t>
-      </w:r>
-      <w:r>
-        <w:rPr>
-          <w:color w:val="2F3437"/>
-          <w:lang w:val="fr-FR"/>
-        </w:rPr>
-        <w:t>e doivent maintenant être mesurés</w:t>
-      </w:r>
-      <w:r>
-        <w:rPr>
-          <w:color w:val="2F3437"/>
-          <w:lang w:val="fr-FR"/>
-        </w:rPr>
-        <w:t xml:space="preserve"> </w:t>
-      </w:r>
-      <w:r>
-        <w:rPr>
-          <w:color w:val="2F3437"/>
-          <w:lang w:val="fr-FR"/>
-        </w:rPr>
-        <w:t xml:space="preserve">scientifiquement via des </w:t>
-      </w:r>
-      <w:r>
-        <w:rPr>
-          <w:color w:val="2F3437"/>
-          <w:lang w:val="fr-FR"/>
-        </w:rPr>
-        <w:t>protocoles comparatifs.</w:t>
-      </w:r>
-    </w:p>
-    <w:p>
-      <w:pPr>
-        <w:spacing w:after="200" w:line="276" w:lineRule="auto"/>
-        <w:rPr>
-          <w:lang w:val="fr-FR"/>
-        </w:rPr>
-      </w:pPr>
-      <w:r>
-        <w:rPr>
-          <w:lang w:val="fr-FR"/>
-        </w:rPr>
-        <w:br w:type="page"/>
+        <w:t>La ROP est surtout pertinente comme approche fonctionnelle et intégrative, dont les effets spécifiques restent à tester par des protocoles comparatifs.</w:t>
       </w:r>
     </w:p>
     <w:p>
@@ -5437,554 +5278,889 @@
         <w:spacing w:after="40"/>
         <w:ind w:left="360" w:hanging="360"/>
         <w:rPr>
-          <w:lang w:val="fr-FR"/>
-        </w:rPr>
-      </w:pPr>
-    </w:p>
-    <w:p>
-      <w:pPr>
-        <w:pStyle w:val="Heading1"/>
-      </w:pPr>
-      <w:proofErr w:type="spellStart"/>
-      <w:r>
-        <w:rPr>
-          <w:rFonts w:ascii="Liberation Sans" w:eastAsia="Liberation Sans" w:hAnsi="Liberation Sans"/>
-        </w:rPr>
-        <w:t>Repères</w:t>
-      </w:r>
-      <w:proofErr w:type="spellEnd"/>
-      <w:r>
-        <w:rPr>
-          <w:rFonts w:ascii="Liberation Sans" w:eastAsia="Liberation Sans" w:hAnsi="Liberation Sans"/>
-        </w:rPr>
-        <w:t xml:space="preserve"> </w:t>
-      </w:r>
-      <w:proofErr w:type="spellStart"/>
-      <w:r>
-        <w:rPr>
-          <w:rFonts w:ascii="Liberation Sans" w:eastAsia="Liberation Sans" w:hAnsi="Liberation Sans"/>
-        </w:rPr>
-        <w:t>bibliographiques</w:t>
-      </w:r>
-      <w:proofErr w:type="spellEnd"/>
-    </w:p>
-    <w:p>
-      <w:pPr>
-        <w:pStyle w:val="BodyText"/>
+          <w:color w:val="2F3437"/>
+          <w:lang w:val="fr-FR"/>
+        </w:rPr>
+      </w:pPr>
+    </w:p>
+    <w:p>
+      <w:pPr>
+        <w:spacing w:after="200" w:line="276" w:lineRule="auto"/>
+        <w:rPr>
+          <w:color w:val="2F3437"/>
+          <w:lang w:val="fr-FR"/>
+        </w:rPr>
+      </w:pPr>
+      <w:r>
+        <w:rPr>
+          <w:color w:val="2F3437"/>
+          <w:lang w:val="fr-FR"/>
+        </w:rPr>
+        <w:br w:type="page"/>
+      </w:r>
+    </w:p>
+    <w:p>
+      <w:pPr>
+        <w:pStyle w:val="ListBullet"/>
         <w:numPr>
           <w:ilvl w:val="0"/>
+          <w:numId w:val="0"/>
+        </w:numPr>
+        <w:spacing w:after="40"/>
+        <w:ind w:left="360" w:hanging="360"/>
+        <w:rPr>
+          <w:lang w:val="fr-FR"/>
+        </w:rPr>
+      </w:pPr>
+    </w:p>
+    <w:p>
+      <w:pPr>
+        <w:pStyle w:val="Heading1"/>
+        <w:rPr>
+          <w:rFonts w:ascii="Liberation Sans" w:eastAsia="Liberation Sans" w:hAnsi="Liberation Sans"/>
+          <w:lang w:val="fr-FR"/>
+        </w:rPr>
+      </w:pPr>
+      <w:r>
+        <w:rPr>
+          <w:rFonts w:ascii="Liberation Sans" w:eastAsia="Liberation Sans" w:hAnsi="Liberation Sans"/>
+          <w:lang w:val="fr-FR"/>
+        </w:rPr>
+        <w:t xml:space="preserve">Zones reflexes </w:t>
+      </w:r>
+      <w:proofErr w:type="spellStart"/>
+      <w:r>
+        <w:rPr>
+          <w:rFonts w:ascii="Liberation Sans" w:eastAsia="Liberation Sans" w:hAnsi="Liberation Sans"/>
+          <w:lang w:val="fr-FR"/>
+        </w:rPr>
+        <w:t>podales</w:t>
+      </w:r>
+      <w:proofErr w:type="spellEnd"/>
+      <w:r>
+        <w:rPr>
+          <w:rFonts w:ascii="Liberation Sans" w:eastAsia="Liberation Sans" w:hAnsi="Liberation Sans"/>
+          <w:lang w:val="fr-FR"/>
+        </w:rPr>
+        <w:t xml:space="preserve">  </w:t>
+      </w:r>
+    </w:p>
+    <w:p>
+      <w:pPr>
+        <w:pStyle w:val="ListParagraph"/>
+        <w:numPr>
+          <w:ilvl w:val="1"/>
           <w:numId w:val="18"/>
         </w:numPr>
-        <w:spacing w:after="60"/>
-        <w:rPr>
-          <w:color w:val="2F3437"/>
-          <w:sz w:val="18"/>
-        </w:rPr>
-      </w:pPr>
-      <w:r>
-        <w:rPr>
-          <w:color w:val="2F3437"/>
-          <w:sz w:val="18"/>
-        </w:rPr>
-        <w:t xml:space="preserve">McEwen BS. Physiology and neurobiology of stress and adaptation: central role of the brain. </w:t>
-      </w:r>
-      <w:r>
-        <w:rPr>
-          <w:i/>
-          <w:iCs/>
-          <w:color w:val="2F3437"/>
-          <w:sz w:val="18"/>
-        </w:rPr>
-        <w:t>Physiological Reviews</w:t>
-      </w:r>
-      <w:r>
-        <w:rPr>
-          <w:color w:val="2F3437"/>
-          <w:sz w:val="18"/>
-        </w:rPr>
-        <w:t xml:space="preserve">. 2007;87(3):873–904. doi:10.1152/physrev.00041.2006. </w:t>
-      </w:r>
-    </w:p>
-    <w:p>
-      <w:pPr>
-        <w:pStyle w:val="BodyText"/>
+        <w:spacing w:after="200" w:line="276" w:lineRule="auto"/>
+        <w:jc w:val="both"/>
+        <w:rPr>
+          <w:rFonts w:ascii="Times New Roman" w:hAnsi="Times New Roman" w:cs="Times New Roman"/>
+          <w:b/>
+          <w:sz w:val="24"/>
+          <w:szCs w:val="24"/>
+        </w:rPr>
+      </w:pPr>
+      <w:proofErr w:type="gramStart"/>
+      <w:r>
+        <w:rPr>
+          <w:rFonts w:ascii="Times New Roman" w:hAnsi="Times New Roman" w:cs="Times New Roman"/>
+          <w:b/>
+          <w:sz w:val="24"/>
+          <w:szCs w:val="24"/>
+        </w:rPr>
+        <w:t xml:space="preserve">Zones </w:t>
+      </w:r>
+      <w:proofErr w:type="spellStart"/>
+      <w:r>
+        <w:rPr>
+          <w:rFonts w:ascii="Times New Roman" w:hAnsi="Times New Roman" w:cs="Times New Roman"/>
+          <w:b/>
+          <w:sz w:val="24"/>
+          <w:szCs w:val="24"/>
+        </w:rPr>
+        <w:t>occipitales</w:t>
+      </w:r>
+      <w:proofErr w:type="spellEnd"/>
+      <w:proofErr w:type="gramEnd"/>
+    </w:p>
+    <w:p>
+      <w:pPr>
+        <w:pStyle w:val="ListParagraph"/>
+        <w:numPr>
+          <w:ilvl w:val="1"/>
+          <w:numId w:val="18"/>
+        </w:numPr>
+        <w:spacing w:after="200" w:line="276" w:lineRule="auto"/>
+        <w:jc w:val="both"/>
+        <w:rPr>
+          <w:rFonts w:ascii="Times New Roman" w:hAnsi="Times New Roman" w:cs="Times New Roman"/>
+          <w:b/>
+          <w:sz w:val="24"/>
+          <w:szCs w:val="24"/>
+        </w:rPr>
+      </w:pPr>
+      <w:r>
+        <w:rPr>
+          <w:rFonts w:ascii="Times New Roman" w:hAnsi="Times New Roman" w:cs="Times New Roman"/>
+          <w:b/>
+          <w:sz w:val="24"/>
+          <w:szCs w:val="24"/>
+        </w:rPr>
+        <w:t xml:space="preserve">Syndrome </w:t>
+      </w:r>
+      <w:proofErr w:type="spellStart"/>
+      <w:r>
+        <w:rPr>
+          <w:rFonts w:ascii="Times New Roman" w:hAnsi="Times New Roman" w:cs="Times New Roman"/>
+          <w:b/>
+          <w:sz w:val="24"/>
+          <w:szCs w:val="24"/>
+        </w:rPr>
+        <w:t>général</w:t>
+      </w:r>
+      <w:proofErr w:type="spellEnd"/>
+      <w:r>
+        <w:rPr>
+          <w:rFonts w:ascii="Times New Roman" w:hAnsi="Times New Roman" w:cs="Times New Roman"/>
+          <w:b/>
+          <w:sz w:val="24"/>
+          <w:szCs w:val="24"/>
+        </w:rPr>
+        <w:t xml:space="preserve"> </w:t>
+      </w:r>
+      <w:proofErr w:type="spellStart"/>
+      <w:r>
+        <w:rPr>
+          <w:rFonts w:ascii="Times New Roman" w:hAnsi="Times New Roman" w:cs="Times New Roman"/>
+          <w:b/>
+          <w:sz w:val="24"/>
+          <w:szCs w:val="24"/>
+        </w:rPr>
+        <w:t>d’adaptation</w:t>
+      </w:r>
+      <w:proofErr w:type="spellEnd"/>
+      <w:r>
+        <w:rPr>
+          <w:rFonts w:ascii="Times New Roman" w:hAnsi="Times New Roman" w:cs="Times New Roman"/>
+          <w:b/>
+          <w:sz w:val="24"/>
+          <w:szCs w:val="24"/>
+        </w:rPr>
+        <w:t xml:space="preserve"> SGA</w:t>
+      </w:r>
+      <w:r>
+        <w:rPr>
+          <w:rFonts w:ascii="Times New Roman" w:hAnsi="Times New Roman" w:cs="Times New Roman"/>
+          <w:b/>
+          <w:sz w:val="24"/>
+          <w:szCs w:val="24"/>
+        </w:rPr>
+        <w:t xml:space="preserve"> </w:t>
+      </w:r>
+    </w:p>
+    <w:p>
+      <w:pPr>
+        <w:pStyle w:val="ListParagraph"/>
         <w:numPr>
           <w:ilvl w:val="0"/>
-          <w:numId w:val="18"/>
+          <w:numId w:val="19"/>
         </w:numPr>
-        <w:spacing w:after="60"/>
-        <w:rPr>
-          <w:color w:val="2F3437"/>
-          <w:sz w:val="18"/>
-        </w:rPr>
-      </w:pPr>
-      <w:r>
-        <w:rPr>
-          <w:color w:val="2F3437"/>
-          <w:sz w:val="18"/>
-        </w:rPr>
-        <w:t xml:space="preserve">Bobba-Alves N, Juster RP, Picard M. The energetic cost of allostasis and allostatic load. </w:t>
-      </w:r>
-      <w:proofErr w:type="spellStart"/>
-      <w:r>
-        <w:rPr>
-          <w:i/>
-          <w:iCs/>
-          <w:color w:val="2F3437"/>
-          <w:sz w:val="18"/>
-        </w:rPr>
-        <w:t>Psychoneuroendocrinology</w:t>
-      </w:r>
-      <w:proofErr w:type="spellEnd"/>
-      <w:r>
-        <w:rPr>
-          <w:color w:val="2F3437"/>
-          <w:sz w:val="18"/>
-        </w:rPr>
-        <w:t xml:space="preserve">. </w:t>
-      </w:r>
-      <w:proofErr w:type="gramStart"/>
-      <w:r>
-        <w:rPr>
-          <w:color w:val="2F3437"/>
-          <w:sz w:val="18"/>
-        </w:rPr>
-        <w:t>2022;146:105951</w:t>
-      </w:r>
-      <w:proofErr w:type="gramEnd"/>
-      <w:r>
-        <w:rPr>
-          <w:color w:val="2F3437"/>
-          <w:sz w:val="18"/>
-        </w:rPr>
-        <w:t xml:space="preserve">. </w:t>
-      </w:r>
-      <w:proofErr w:type="gramStart"/>
-      <w:r>
-        <w:rPr>
-          <w:color w:val="2F3437"/>
-          <w:sz w:val="18"/>
-        </w:rPr>
-        <w:t>doi:10.1016/j.psyneuen</w:t>
-      </w:r>
-      <w:proofErr w:type="gramEnd"/>
-      <w:r>
-        <w:rPr>
-          <w:color w:val="2F3437"/>
-          <w:sz w:val="18"/>
-        </w:rPr>
-        <w:t xml:space="preserve">.2022.105951. </w:t>
-      </w:r>
-    </w:p>
-    <w:p>
-      <w:pPr>
-        <w:pStyle w:val="BodyText"/>
+        <w:spacing w:after="200" w:line="276" w:lineRule="auto"/>
+        <w:jc w:val="both"/>
+        <w:rPr>
+          <w:rFonts w:ascii="Times New Roman" w:hAnsi="Times New Roman" w:cs="Times New Roman"/>
+          <w:b/>
+          <w:sz w:val="24"/>
+          <w:szCs w:val="24"/>
+          <w:lang w:val="fr-FR"/>
+        </w:rPr>
+      </w:pPr>
+      <w:r>
+        <w:rPr>
+          <w:rFonts w:ascii="Times New Roman" w:hAnsi="Times New Roman" w:cs="Times New Roman"/>
+          <w:b/>
+          <w:sz w:val="24"/>
+          <w:szCs w:val="24"/>
+          <w:lang w:val="fr-FR"/>
+        </w:rPr>
+        <w:t>Système limbique, diencéphale, tronc cérébral hypophyse, surrénales (axe HHS) ;</w:t>
+      </w:r>
+    </w:p>
+    <w:p>
+      <w:pPr>
+        <w:pStyle w:val="ListParagraph"/>
         <w:numPr>
           <w:ilvl w:val="0"/>
-          <w:numId w:val="18"/>
+          <w:numId w:val="19"/>
         </w:numPr>
-        <w:spacing w:after="60"/>
-        <w:rPr>
-          <w:color w:val="2F3437"/>
-          <w:sz w:val="18"/>
-        </w:rPr>
-      </w:pPr>
-      <w:r>
-        <w:rPr>
-          <w:color w:val="2F3437"/>
-          <w:sz w:val="18"/>
-        </w:rPr>
-        <w:t xml:space="preserve">Bobba-Alves N, Sturm G, Lin J, Ware SA, Karan KR, Monzel AS, et al. Cellular allostatic load is linked to increased energy expenditure and accelerated biological aging. </w:t>
-      </w:r>
-      <w:proofErr w:type="spellStart"/>
-      <w:r>
-        <w:rPr>
-          <w:i/>
-          <w:iCs/>
-          <w:color w:val="2F3437"/>
-          <w:sz w:val="18"/>
-        </w:rPr>
-        <w:t>Psychoneuroendocrinology</w:t>
-      </w:r>
-      <w:proofErr w:type="spellEnd"/>
-      <w:r>
-        <w:rPr>
-          <w:color w:val="2F3437"/>
-          <w:sz w:val="18"/>
-        </w:rPr>
-        <w:t xml:space="preserve">. </w:t>
-      </w:r>
-      <w:proofErr w:type="gramStart"/>
-      <w:r>
-        <w:rPr>
-          <w:color w:val="2F3437"/>
-          <w:sz w:val="18"/>
-        </w:rPr>
-        <w:t>2023;155:106322</w:t>
-      </w:r>
-      <w:proofErr w:type="gramEnd"/>
-      <w:r>
-        <w:rPr>
-          <w:color w:val="2F3437"/>
-          <w:sz w:val="18"/>
-        </w:rPr>
-        <w:t xml:space="preserve">. </w:t>
-      </w:r>
-      <w:proofErr w:type="gramStart"/>
-      <w:r>
-        <w:rPr>
-          <w:color w:val="2F3437"/>
-          <w:sz w:val="18"/>
-        </w:rPr>
-        <w:t>doi:10.1016/j.psyneuen</w:t>
-      </w:r>
-      <w:proofErr w:type="gramEnd"/>
-      <w:r>
-        <w:rPr>
-          <w:color w:val="2F3437"/>
-          <w:sz w:val="18"/>
-        </w:rPr>
-        <w:t xml:space="preserve">.2023.106322. </w:t>
-      </w:r>
-    </w:p>
-    <w:p>
-      <w:pPr>
-        <w:pStyle w:val="BodyText"/>
+        <w:spacing w:after="200" w:line="276" w:lineRule="auto"/>
+        <w:jc w:val="both"/>
+        <w:rPr>
+          <w:rFonts w:ascii="Times New Roman" w:hAnsi="Times New Roman" w:cs="Times New Roman"/>
+          <w:b/>
+          <w:sz w:val="24"/>
+          <w:szCs w:val="24"/>
+          <w:lang w:val="fr-FR"/>
+        </w:rPr>
+      </w:pPr>
+      <w:r>
+        <w:rPr>
+          <w:rFonts w:ascii="Times New Roman" w:hAnsi="Times New Roman" w:cs="Times New Roman"/>
+          <w:b/>
+          <w:sz w:val="24"/>
+          <w:szCs w:val="24"/>
+          <w:lang w:val="fr-FR"/>
+        </w:rPr>
+        <w:t>Nerfs crâniens </w:t>
+      </w:r>
+      <w:r>
+        <w:rPr>
+          <w:rFonts w:ascii="Times New Roman" w:hAnsi="Times New Roman" w:cs="Times New Roman"/>
+          <w:sz w:val="24"/>
+          <w:szCs w:val="24"/>
+          <w:lang w:val="fr-FR"/>
+        </w:rPr>
+        <w:t>: Jumeau V, Vague X, Hypoglosse XI, C2 et C3 ;</w:t>
+      </w:r>
+    </w:p>
+    <w:p>
+      <w:pPr>
+        <w:pStyle w:val="ListParagraph"/>
         <w:numPr>
           <w:ilvl w:val="0"/>
-          <w:numId w:val="18"/>
+          <w:numId w:val="19"/>
         </w:numPr>
-        <w:spacing w:after="60"/>
-        <w:rPr>
-          <w:color w:val="2F3437"/>
-          <w:sz w:val="18"/>
-        </w:rPr>
-      </w:pPr>
-      <w:r>
-        <w:rPr>
-          <w:color w:val="2F3437"/>
-          <w:sz w:val="18"/>
-        </w:rPr>
-        <w:t xml:space="preserve">Picard M, Murugan NJ. The energy resistance principle. </w:t>
-      </w:r>
-      <w:r>
-        <w:rPr>
-          <w:i/>
-          <w:iCs/>
-          <w:color w:val="2F3437"/>
-          <w:sz w:val="18"/>
-        </w:rPr>
-        <w:t>Cell Metabolism</w:t>
-      </w:r>
-      <w:r>
-        <w:rPr>
-          <w:color w:val="2F3437"/>
-          <w:sz w:val="18"/>
-        </w:rPr>
-        <w:t xml:space="preserve">. 2025;37(11):2107–2127. </w:t>
-      </w:r>
-      <w:proofErr w:type="gramStart"/>
-      <w:r>
-        <w:rPr>
-          <w:color w:val="2F3437"/>
-          <w:sz w:val="18"/>
-        </w:rPr>
-        <w:t>doi:10.1016/j.cmet</w:t>
-      </w:r>
-      <w:proofErr w:type="gramEnd"/>
-      <w:r>
-        <w:rPr>
-          <w:color w:val="2F3437"/>
-          <w:sz w:val="18"/>
-        </w:rPr>
-        <w:t xml:space="preserve">.2025.09.002. </w:t>
-      </w:r>
-    </w:p>
-    <w:p>
-      <w:pPr>
-        <w:pStyle w:val="BodyText"/>
+        <w:spacing w:after="200" w:line="276" w:lineRule="auto"/>
+        <w:jc w:val="both"/>
+        <w:rPr>
+          <w:rFonts w:ascii="Times New Roman" w:hAnsi="Times New Roman" w:cs="Times New Roman"/>
+          <w:sz w:val="24"/>
+          <w:szCs w:val="24"/>
+          <w:lang w:val="fr-FR"/>
+        </w:rPr>
+      </w:pPr>
+      <w:r>
+        <w:rPr>
+          <w:rFonts w:ascii="Times New Roman" w:hAnsi="Times New Roman" w:cs="Times New Roman"/>
+          <w:b/>
+          <w:sz w:val="24"/>
+          <w:szCs w:val="24"/>
+          <w:lang w:val="fr-FR"/>
+        </w:rPr>
+        <w:t>Nerf vague X </w:t>
+      </w:r>
+      <w:r>
+        <w:rPr>
+          <w:rFonts w:ascii="Times New Roman" w:hAnsi="Times New Roman" w:cs="Times New Roman"/>
+          <w:sz w:val="24"/>
+          <w:szCs w:val="24"/>
+          <w:lang w:val="fr-FR"/>
+        </w:rPr>
+        <w:t>: foramen magnum, foramen jugulaire, loge viscérale du cou, plexus cardio-pulmonaire, hiatus œsophagien, plexus cœliaque ;</w:t>
+      </w:r>
+    </w:p>
+    <w:p>
+      <w:pPr>
+        <w:pStyle w:val="ListParagraph"/>
         <w:numPr>
           <w:ilvl w:val="0"/>
-          <w:numId w:val="18"/>
+          <w:numId w:val="19"/>
         </w:numPr>
-        <w:spacing w:after="60"/>
-        <w:rPr>
-          <w:color w:val="2F3437"/>
-          <w:sz w:val="18"/>
-        </w:rPr>
-      </w:pPr>
-      <w:r>
-        <w:rPr>
-          <w:color w:val="2F3437"/>
-          <w:sz w:val="18"/>
-        </w:rPr>
-        <w:t xml:space="preserve">Descamps E, Boussac M, </w:t>
-      </w:r>
-      <w:proofErr w:type="spellStart"/>
-      <w:r>
-        <w:rPr>
-          <w:color w:val="2F3437"/>
-          <w:sz w:val="18"/>
-        </w:rPr>
-        <w:t>Joineau</w:t>
-      </w:r>
-      <w:proofErr w:type="spellEnd"/>
-      <w:r>
-        <w:rPr>
-          <w:color w:val="2F3437"/>
-          <w:sz w:val="18"/>
-        </w:rPr>
-        <w:t xml:space="preserve"> K, </w:t>
-      </w:r>
-      <w:proofErr w:type="spellStart"/>
-      <w:r>
-        <w:rPr>
-          <w:color w:val="2F3437"/>
-          <w:sz w:val="18"/>
-        </w:rPr>
-        <w:t>Payoux</w:t>
-      </w:r>
-      <w:proofErr w:type="spellEnd"/>
-      <w:r>
-        <w:rPr>
-          <w:color w:val="2F3437"/>
-          <w:sz w:val="18"/>
-        </w:rPr>
-        <w:t xml:space="preserve"> P. Changes of cerebral functional connectivity induced by foot reflexology in a RCT. </w:t>
-      </w:r>
-      <w:r>
-        <w:rPr>
-          <w:i/>
-          <w:iCs/>
-          <w:color w:val="2F3437"/>
-          <w:sz w:val="18"/>
-        </w:rPr>
-        <w:t>Scientific Reports</w:t>
-      </w:r>
-      <w:r>
-        <w:rPr>
-          <w:color w:val="2F3437"/>
-          <w:sz w:val="18"/>
-        </w:rPr>
-        <w:t xml:space="preserve">. 2023;13(1):17139. doi:10.1038/s41598-023-44325-x. </w:t>
-      </w:r>
-    </w:p>
-    <w:p>
-      <w:pPr>
-        <w:pStyle w:val="BodyText"/>
+        <w:spacing w:after="200" w:line="276" w:lineRule="auto"/>
+        <w:jc w:val="both"/>
+        <w:rPr>
+          <w:rFonts w:ascii="Times New Roman" w:hAnsi="Times New Roman" w:cs="Times New Roman"/>
+          <w:sz w:val="24"/>
+          <w:szCs w:val="24"/>
+          <w:lang w:val="fr-FR"/>
+        </w:rPr>
+      </w:pPr>
+      <w:r>
+        <w:rPr>
+          <w:rFonts w:ascii="Times New Roman" w:hAnsi="Times New Roman" w:cs="Times New Roman"/>
+          <w:b/>
+          <w:sz w:val="24"/>
+          <w:szCs w:val="24"/>
+          <w:lang w:val="fr-FR"/>
+        </w:rPr>
+        <w:t>Colonne vertébrale </w:t>
+      </w:r>
+      <w:r>
+        <w:rPr>
+          <w:rFonts w:ascii="Times New Roman" w:hAnsi="Times New Roman" w:cs="Times New Roman"/>
+          <w:sz w:val="24"/>
+          <w:szCs w:val="24"/>
+          <w:lang w:val="fr-FR"/>
+        </w:rPr>
+        <w:t>: systèmes sympathique C8 à L2 et parasympathique pelvien S2 à S4 ;</w:t>
+      </w:r>
+    </w:p>
+    <w:p>
+      <w:pPr>
+        <w:pStyle w:val="ListParagraph"/>
         <w:numPr>
           <w:ilvl w:val="0"/>
-          <w:numId w:val="18"/>
+          <w:numId w:val="19"/>
         </w:numPr>
-        <w:spacing w:after="60"/>
-        <w:rPr>
-          <w:color w:val="2F3437"/>
-          <w:sz w:val="18"/>
-        </w:rPr>
-      </w:pPr>
-      <w:r>
-        <w:rPr>
-          <w:color w:val="2F3437"/>
-          <w:sz w:val="18"/>
-        </w:rPr>
-        <w:t xml:space="preserve">Khalsa SS, Adolphs R, Cameron OG, Critchley HD, Davenport PW, Feinstein JS, et al. Interoception and mental health: a roadmap. </w:t>
-      </w:r>
-      <w:r>
-        <w:rPr>
-          <w:i/>
-          <w:iCs/>
-          <w:color w:val="2F3437"/>
-          <w:sz w:val="18"/>
-        </w:rPr>
-        <w:t>Biological Psychiatry: Cognitive Neuroscience and Neuroimaging</w:t>
-      </w:r>
-      <w:r>
-        <w:rPr>
-          <w:color w:val="2F3437"/>
-          <w:sz w:val="18"/>
-        </w:rPr>
-        <w:t xml:space="preserve">. 2018;3(6):501–513. </w:t>
-      </w:r>
-      <w:proofErr w:type="gramStart"/>
-      <w:r>
-        <w:rPr>
-          <w:color w:val="2F3437"/>
-          <w:sz w:val="18"/>
-        </w:rPr>
-        <w:t>doi:10.1016/j.bpsc</w:t>
-      </w:r>
-      <w:proofErr w:type="gramEnd"/>
-      <w:r>
-        <w:rPr>
-          <w:color w:val="2F3437"/>
-          <w:sz w:val="18"/>
-        </w:rPr>
-        <w:t xml:space="preserve">.2017.12.004. </w:t>
-      </w:r>
-    </w:p>
-    <w:p>
-      <w:pPr>
-        <w:pStyle w:val="BodyText"/>
+        <w:spacing w:after="200" w:line="276" w:lineRule="auto"/>
+        <w:jc w:val="both"/>
+        <w:rPr>
+          <w:rFonts w:ascii="Times New Roman" w:hAnsi="Times New Roman" w:cs="Times New Roman"/>
+          <w:sz w:val="24"/>
+          <w:szCs w:val="24"/>
+          <w:lang w:val="fr-FR"/>
+        </w:rPr>
+      </w:pPr>
+      <w:r>
+        <w:rPr>
+          <w:rFonts w:ascii="Times New Roman" w:hAnsi="Times New Roman" w:cs="Times New Roman"/>
+          <w:b/>
+          <w:sz w:val="24"/>
+          <w:szCs w:val="24"/>
+          <w:lang w:val="fr-FR"/>
+        </w:rPr>
+        <w:t>Nerf phrénique </w:t>
+      </w:r>
+      <w:r>
+        <w:rPr>
+          <w:rFonts w:ascii="Times New Roman" w:hAnsi="Times New Roman" w:cs="Times New Roman"/>
+          <w:sz w:val="24"/>
+          <w:szCs w:val="24"/>
+          <w:lang w:val="fr-FR"/>
+        </w:rPr>
+        <w:t>:</w:t>
+      </w:r>
+      <w:r>
+        <w:rPr>
+          <w:rFonts w:ascii="Times New Roman" w:hAnsi="Times New Roman" w:cs="Times New Roman"/>
+          <w:b/>
+          <w:color w:val="FF0000"/>
+          <w:sz w:val="24"/>
+          <w:szCs w:val="24"/>
+          <w:lang w:val="fr-FR"/>
+        </w:rPr>
+        <w:t xml:space="preserve"> </w:t>
+      </w:r>
+      <w:r>
+        <w:rPr>
+          <w:rFonts w:ascii="Times New Roman" w:hAnsi="Times New Roman" w:cs="Times New Roman"/>
+          <w:sz w:val="24"/>
+          <w:szCs w:val="24"/>
+          <w:lang w:val="fr-FR"/>
+        </w:rPr>
+        <w:t>C3-C4-C5 et</w:t>
+      </w:r>
+      <w:r>
+        <w:rPr>
+          <w:rFonts w:ascii="Times New Roman" w:hAnsi="Times New Roman" w:cs="Times New Roman"/>
+          <w:b/>
+          <w:color w:val="FF0000"/>
+          <w:sz w:val="24"/>
+          <w:szCs w:val="24"/>
+          <w:lang w:val="fr-FR"/>
+        </w:rPr>
+        <w:t xml:space="preserve"> </w:t>
+      </w:r>
+      <w:r>
+        <w:rPr>
+          <w:rFonts w:ascii="Times New Roman" w:hAnsi="Times New Roman" w:cs="Times New Roman"/>
+          <w:b/>
+          <w:sz w:val="24"/>
+          <w:szCs w:val="24"/>
+          <w:lang w:val="fr-FR"/>
+        </w:rPr>
+        <w:t>Triangle de Sédillot</w:t>
+      </w:r>
+      <w:r>
+        <w:rPr>
+          <w:rFonts w:ascii="Times New Roman" w:hAnsi="Times New Roman" w:cs="Times New Roman"/>
+          <w:sz w:val="24"/>
+          <w:szCs w:val="24"/>
+          <w:lang w:val="fr-FR"/>
+        </w:rPr>
+        <w:t xml:space="preserve">  </w:t>
+      </w:r>
+    </w:p>
+    <w:p>
+      <w:pPr>
+        <w:pStyle w:val="ListParagraph"/>
         <w:numPr>
           <w:ilvl w:val="0"/>
-          <w:numId w:val="18"/>
+          <w:numId w:val="20"/>
         </w:numPr>
-        <w:spacing w:after="60"/>
-        <w:rPr>
-          <w:color w:val="2F3437"/>
-          <w:sz w:val="18"/>
-        </w:rPr>
-      </w:pPr>
-      <w:r>
-        <w:rPr>
-          <w:color w:val="2F3437"/>
-          <w:sz w:val="18"/>
-        </w:rPr>
-        <w:t xml:space="preserve">Chen WG, Schloesser D, Arensdorf AM, Simmons JM, Cui C, Valentino R, et al. The emerging science of interoception: sensing, integrating, interpreting, and regulating signals within the self. </w:t>
-      </w:r>
-      <w:r>
-        <w:rPr>
-          <w:i/>
-          <w:iCs/>
-          <w:color w:val="2F3437"/>
-          <w:sz w:val="18"/>
-        </w:rPr>
-        <w:t>Trends in Neurosciences</w:t>
-      </w:r>
-      <w:r>
-        <w:rPr>
-          <w:color w:val="2F3437"/>
-          <w:sz w:val="18"/>
-        </w:rPr>
-        <w:t xml:space="preserve">. 2021;44(1):3–16. </w:t>
+        <w:spacing w:after="200" w:line="276" w:lineRule="auto"/>
+        <w:jc w:val="both"/>
+        <w:rPr>
+          <w:rFonts w:ascii="Times New Roman" w:hAnsi="Times New Roman" w:cs="Times New Roman"/>
+          <w:b/>
+          <w:color w:val="FF0000"/>
+          <w:sz w:val="24"/>
+          <w:szCs w:val="24"/>
+          <w:lang w:val="fr-FR"/>
+        </w:rPr>
+      </w:pPr>
+      <w:r>
+        <w:rPr>
+          <w:rFonts w:ascii="Times New Roman" w:hAnsi="Times New Roman" w:cs="Times New Roman"/>
+          <w:b/>
+          <w:sz w:val="24"/>
+          <w:szCs w:val="24"/>
+          <w:lang w:val="fr-FR"/>
+        </w:rPr>
+        <w:t>Syndrome locorégional</w:t>
+      </w:r>
+      <w:r>
+        <w:rPr>
+          <w:rFonts w:ascii="Times New Roman" w:hAnsi="Times New Roman" w:cs="Times New Roman"/>
+          <w:sz w:val="24"/>
+          <w:szCs w:val="24"/>
+          <w:lang w:val="fr-FR"/>
+        </w:rPr>
+        <w:t> : c’est une</w:t>
+      </w:r>
+      <w:r>
+        <w:rPr>
+          <w:rFonts w:ascii="Times New Roman" w:hAnsi="Times New Roman" w:cs="Times New Roman"/>
+          <w:b/>
+          <w:sz w:val="24"/>
+          <w:szCs w:val="24"/>
+          <w:lang w:val="fr-FR"/>
+        </w:rPr>
+        <w:t xml:space="preserve"> </w:t>
+      </w:r>
+      <w:r>
+        <w:rPr>
+          <w:rFonts w:ascii="Times New Roman" w:hAnsi="Times New Roman" w:cs="Times New Roman"/>
+          <w:sz w:val="24"/>
+          <w:szCs w:val="24"/>
+          <w:lang w:val="fr-FR"/>
+        </w:rPr>
+        <w:t xml:space="preserve">compression mécanique locale du système nerveux somatique </w:t>
       </w:r>
       <w:proofErr w:type="gramStart"/>
       <w:r>
         <w:rPr>
-          <w:color w:val="2F3437"/>
-          <w:sz w:val="18"/>
-        </w:rPr>
-        <w:t>doi:10.1016/j.tins</w:t>
+          <w:rFonts w:ascii="Times New Roman" w:hAnsi="Times New Roman" w:cs="Times New Roman"/>
+          <w:sz w:val="24"/>
+          <w:szCs w:val="24"/>
+          <w:lang w:val="fr-FR"/>
+        </w:rPr>
+        <w:t>ou  autonome</w:t>
       </w:r>
       <w:proofErr w:type="gramEnd"/>
       <w:r>
         <w:rPr>
-          <w:color w:val="2F3437"/>
-          <w:sz w:val="18"/>
-        </w:rPr>
-        <w:t xml:space="preserve">.2020.10.007. </w:t>
-      </w:r>
-    </w:p>
-    <w:p>
-      <w:pPr>
-        <w:pStyle w:val="BodyText"/>
+          <w:rFonts w:ascii="Times New Roman" w:hAnsi="Times New Roman" w:cs="Times New Roman"/>
+          <w:sz w:val="24"/>
+          <w:szCs w:val="24"/>
+          <w:lang w:val="fr-FR"/>
+        </w:rPr>
+        <w:t xml:space="preserve"> avec retentissement secondaire général. </w:t>
+      </w:r>
+      <w:r>
+        <w:rPr>
+          <w:rFonts w:ascii="Times New Roman" w:hAnsi="Times New Roman" w:cs="Times New Roman"/>
+          <w:b/>
+          <w:bCs/>
+          <w:sz w:val="24"/>
+          <w:szCs w:val="24"/>
+          <w:lang w:val="fr-FR"/>
+        </w:rPr>
+        <w:t>1ère phase : irritation locale</w:t>
+      </w:r>
+      <w:r>
+        <w:rPr>
+          <w:rFonts w:ascii="Times New Roman" w:hAnsi="Times New Roman" w:cs="Times New Roman"/>
+          <w:sz w:val="24"/>
+          <w:szCs w:val="24"/>
+          <w:lang w:val="fr-FR"/>
+        </w:rPr>
+        <w:t xml:space="preserve"> par emprisonnement d’un nerf. (</w:t>
+      </w:r>
+      <w:proofErr w:type="gramStart"/>
+      <w:r>
+        <w:rPr>
+          <w:rFonts w:ascii="Times New Roman" w:hAnsi="Times New Roman" w:cs="Times New Roman"/>
+          <w:sz w:val="24"/>
+          <w:szCs w:val="24"/>
+          <w:lang w:val="fr-FR"/>
+        </w:rPr>
+        <w:t>ex</w:t>
+      </w:r>
+      <w:proofErr w:type="gramEnd"/>
+      <w:r>
+        <w:rPr>
+          <w:rFonts w:ascii="Times New Roman" w:hAnsi="Times New Roman" w:cs="Times New Roman"/>
+          <w:sz w:val="24"/>
+          <w:szCs w:val="24"/>
+          <w:lang w:val="fr-FR"/>
+        </w:rPr>
+        <w:t xml:space="preserve"> : compression traumatique du ganglion cervical inférieur par blocage C7/D1/1ère côte. Conséquence : facilitation sympathique du territoire d’influence du ganglion cervical inférieur </w:t>
+      </w:r>
+      <w:r>
+        <w:rPr>
+          <w:rFonts w:ascii="Times New Roman" w:hAnsi="Times New Roman" w:cs="Times New Roman"/>
+          <w:b/>
+          <w:color w:val="FF0000"/>
+          <w:sz w:val="24"/>
+          <w:szCs w:val="24"/>
+          <w:lang w:val="fr-FR"/>
+        </w:rPr>
+        <w:t>(Cf. Chapitre 4 Système nerveux autonome)</w:t>
+      </w:r>
+    </w:p>
+    <w:p>
+      <w:pPr>
+        <w:pStyle w:val="ListParagraph"/>
         <w:numPr>
           <w:ilvl w:val="0"/>
-          <w:numId w:val="18"/>
+          <w:numId w:val="20"/>
         </w:numPr>
-        <w:spacing w:after="60"/>
-        <w:rPr>
-          <w:color w:val="2F3437"/>
-          <w:sz w:val="18"/>
-        </w:rPr>
-      </w:pPr>
-      <w:r>
-        <w:rPr>
-          <w:color w:val="2F3437"/>
-          <w:sz w:val="18"/>
-        </w:rPr>
-        <w:t xml:space="preserve">Hopper SI, Murray SL, Ferrara LR, Singleton JK. Effectiveness of diaphragmatic breathing for reducing physiological and psychological stress in adults: a quantitative systematic review. </w:t>
-      </w:r>
-      <w:r>
-        <w:rPr>
-          <w:i/>
-          <w:iCs/>
-          <w:color w:val="2F3437"/>
-          <w:sz w:val="18"/>
-        </w:rPr>
-        <w:t>JBI Database of Systematic Reviews and Implementation Reports</w:t>
-      </w:r>
-      <w:r>
-        <w:rPr>
-          <w:color w:val="2F3437"/>
-          <w:sz w:val="18"/>
-        </w:rPr>
-        <w:t xml:space="preserve">. 2019;17(9):1855–1876. doi:10.11124/JBISRIR-2017-003848. </w:t>
-      </w:r>
-    </w:p>
-    <w:p>
-      <w:pPr>
-        <w:pStyle w:val="BodyText"/>
+        <w:spacing w:after="200" w:line="276" w:lineRule="auto"/>
+        <w:rPr>
+          <w:rFonts w:ascii="Times New Roman" w:hAnsi="Times New Roman" w:cs="Times New Roman"/>
+          <w:sz w:val="24"/>
+          <w:szCs w:val="24"/>
+          <w:lang w:val="fr-FR"/>
+        </w:rPr>
+      </w:pPr>
+      <w:r>
+        <w:rPr>
+          <w:rFonts w:ascii="Times New Roman" w:hAnsi="Times New Roman" w:cs="Times New Roman"/>
+          <w:b/>
+          <w:bCs/>
+          <w:sz w:val="24"/>
+          <w:szCs w:val="24"/>
+          <w:lang w:val="fr-FR"/>
+        </w:rPr>
+        <w:t>2ème phase : inhibition</w:t>
+      </w:r>
+      <w:r>
+        <w:rPr>
+          <w:rFonts w:ascii="Times New Roman" w:hAnsi="Times New Roman" w:cs="Times New Roman"/>
+          <w:sz w:val="24"/>
+          <w:szCs w:val="24"/>
+          <w:lang w:val="fr-FR"/>
+        </w:rPr>
+        <w:t> : si la compression n’est pas levée, le nerf comprimé est considéré comme inhibé. Le système nerveux compensateur est alors libéré d’où, dans l’exemple, syndrome parasympathique par inhibition du système sympathique.</w:t>
+      </w:r>
+      <w:r>
+        <w:rPr>
+          <w:rFonts w:ascii="Times New Roman" w:hAnsi="Times New Roman" w:cs="Times New Roman"/>
+          <w:b/>
+          <w:bCs/>
+          <w:sz w:val="24"/>
+          <w:szCs w:val="24"/>
+          <w:lang w:val="fr-FR"/>
+        </w:rPr>
+        <w:t xml:space="preserve"> </w:t>
+      </w:r>
+    </w:p>
+    <w:p>
+      <w:pPr>
+        <w:pStyle w:val="ListBullet"/>
         <w:numPr>
           <w:ilvl w:val="0"/>
-          <w:numId w:val="18"/>
+          <w:numId w:val="0"/>
         </w:numPr>
-        <w:spacing w:after="60"/>
-        <w:rPr>
-          <w:color w:val="2F3437"/>
-          <w:sz w:val="18"/>
-        </w:rPr>
-      </w:pPr>
-      <w:r>
-        <w:rPr>
-          <w:color w:val="2F3437"/>
-          <w:sz w:val="18"/>
-        </w:rPr>
-        <w:t xml:space="preserve">Cannon WB. </w:t>
-      </w:r>
-      <w:r>
-        <w:rPr>
-          <w:i/>
-          <w:iCs/>
-          <w:color w:val="2F3437"/>
-          <w:sz w:val="18"/>
-        </w:rPr>
-        <w:t>The Wisdom of the Body</w:t>
-      </w:r>
-      <w:r>
-        <w:rPr>
-          <w:color w:val="2F3437"/>
-          <w:sz w:val="18"/>
-        </w:rPr>
-        <w:t xml:space="preserve">. New York: W.W. Norton &amp; Company; 1932. </w:t>
-      </w:r>
-    </w:p>
-    <w:p>
-      <w:pPr>
-        <w:pStyle w:val="BodyText"/>
+        <w:spacing w:after="40"/>
+        <w:ind w:left="360" w:hanging="360"/>
+        <w:rPr>
+          <w:lang w:val="fr-FR"/>
+        </w:rPr>
+      </w:pPr>
+    </w:p>
+    <w:p>
+      <w:pPr>
+        <w:spacing w:after="200" w:line="276" w:lineRule="auto"/>
+        <w:rPr>
+          <w:lang w:val="fr-FR"/>
+        </w:rPr>
+      </w:pPr>
+      <w:r>
+        <w:rPr>
+          <w:lang w:val="fr-FR"/>
+        </w:rPr>
+        <w:br w:type="page"/>
+      </w:r>
+    </w:p>
+    <w:p>
+      <w:pPr>
+        <w:pStyle w:val="ListBullet"/>
         <w:numPr>
           <w:ilvl w:val="0"/>
-          <w:numId w:val="18"/>
+          <w:numId w:val="0"/>
         </w:numPr>
+        <w:spacing w:after="40"/>
+        <w:ind w:left="360" w:hanging="360"/>
+        <w:rPr>
+          <w:lang w:val="fr-FR"/>
+        </w:rPr>
+      </w:pPr>
+    </w:p>
+    <w:p>
+      <w:pPr>
+        <w:pStyle w:val="Heading1"/>
+      </w:pPr>
+      <w:proofErr w:type="spellStart"/>
+      <w:r>
+        <w:rPr>
+          <w:rFonts w:ascii="Liberation Sans" w:eastAsia="Liberation Sans" w:hAnsi="Liberation Sans"/>
+        </w:rPr>
+        <w:t>Repères</w:t>
+      </w:r>
+      <w:proofErr w:type="spellEnd"/>
+      <w:r>
+        <w:rPr>
+          <w:rFonts w:ascii="Liberation Sans" w:eastAsia="Liberation Sans" w:hAnsi="Liberation Sans"/>
+        </w:rPr>
+        <w:t xml:space="preserve"> </w:t>
+      </w:r>
+      <w:proofErr w:type="spellStart"/>
+      <w:r>
+        <w:rPr>
+          <w:rFonts w:ascii="Liberation Sans" w:eastAsia="Liberation Sans" w:hAnsi="Liberation Sans"/>
+        </w:rPr>
+        <w:t>bibliographiques</w:t>
+      </w:r>
+      <w:proofErr w:type="spellEnd"/>
+    </w:p>
+    <w:p>
+      <w:pPr>
+        <w:pStyle w:val="BodyText"/>
         <w:spacing w:after="60"/>
+        <w:ind w:left="312" w:hanging="312"/>
+      </w:pPr>
+      <w:r>
         <w:rPr>
           <w:color w:val="2F3437"/>
           <w:sz w:val="18"/>
         </w:rPr>
+        <w:t>1. McEwen BS. Physiology and neurobiology of stress and adaptation: central role of the brain. Physiological Reviews. 2007;87(3):873-904. doi:10.1152/physrev.00041.2006.</w:t>
+      </w:r>
+    </w:p>
+    <w:p>
+      <w:pPr>
+        <w:pStyle w:val="BodyText"/>
+        <w:spacing w:after="60"/>
+        <w:ind w:left="312" w:hanging="312"/>
       </w:pPr>
       <w:r>
         <w:rPr>
           <w:color w:val="2F3437"/>
           <w:sz w:val="18"/>
         </w:rPr>
-        <w:t xml:space="preserve">Selye H. </w:t>
-      </w:r>
-      <w:r>
-        <w:rPr>
-          <w:i/>
-          <w:iCs/>
+        <w:t>2. Bobba-Alves N, Juster RP, Picard M. The energetic cost of allostasis and allostatic load. Psychoneuroendocrinology. 2022;146:105951. doi:10.1016/j.psyneuen.2022.105951.</w:t>
+      </w:r>
+    </w:p>
+    <w:p>
+      <w:pPr>
+        <w:pStyle w:val="BodyText"/>
+        <w:spacing w:after="60"/>
+        <w:ind w:left="312" w:hanging="312"/>
+      </w:pPr>
+      <w:r>
+        <w:rPr>
           <w:color w:val="2F3437"/>
           <w:sz w:val="18"/>
         </w:rPr>
-        <w:t>The Stress of Life</w:t>
-      </w:r>
+        <w:t>3. Bobba-Alves N, et al. Cellular allostatic load is linked to increased energy expenditure and accelerated biological aging. Psychoneuroendocrinology. 2023;155:106322. doi:10.1016/j.psyneuen.2023.106322.</w:t>
+      </w:r>
+    </w:p>
+    <w:p>
+      <w:pPr>
+        <w:pStyle w:val="BodyText"/>
+        <w:spacing w:after="60"/>
+        <w:ind w:left="312" w:hanging="312"/>
+      </w:pPr>
       <w:r>
         <w:rPr>
           <w:color w:val="2F3437"/>
           <w:sz w:val="18"/>
         </w:rPr>
-        <w:t>. New York: McGraw-Hill; 1956.</w:t>
-      </w:r>
+        <w:t>4. Picard M, Murugan NJ. The energy resistance principle. Cell Metabolism. 2025;37. doi:10.1016/j.cmet.2025.09.002.</w:t>
+      </w:r>
+    </w:p>
+    <w:p>
+      <w:pPr>
+        <w:pStyle w:val="BodyText"/>
+        <w:spacing w:after="60"/>
+        <w:ind w:left="312" w:hanging="312"/>
+      </w:pPr>
+      <w:r>
+        <w:rPr>
+          <w:color w:val="2F3437"/>
+          <w:sz w:val="18"/>
+          <w:lang w:val="fr-FR"/>
+        </w:rPr>
+        <w:t xml:space="preserve">5. Descamps E, Boussac M, Joineau K, et al. </w:t>
+      </w:r>
+      <w:r>
+        <w:rPr>
+          <w:color w:val="2F3437"/>
+          <w:sz w:val="18"/>
+        </w:rPr>
+        <w:t>Changes of cerebral functional connectivity induced by foot reflexology in a randomized controlled trial. Scientific Reports. 2023;13:17139. doi:10.1038/s41598-023-44325-x.</w:t>
+      </w:r>
+    </w:p>
+    <w:p>
+      <w:pPr>
+        <w:pStyle w:val="BodyText"/>
+        <w:spacing w:after="60"/>
+        <w:ind w:left="312" w:hanging="312"/>
+      </w:pPr>
+      <w:r>
+        <w:rPr>
+          <w:color w:val="2F3437"/>
+          <w:sz w:val="18"/>
+        </w:rPr>
+        <w:t>6. Khalsa SS, et al. Interoception and mental health: a roadmap. Biological Psychiatry: Cognitive Neuroscience and Neuroimaging. 2018;3(6):501-513. doi:10.1016/j.bpsc.2017.12.004.</w:t>
+      </w:r>
+    </w:p>
+    <w:p>
+      <w:pPr>
+        <w:pStyle w:val="BodyText"/>
+        <w:spacing w:after="60"/>
+        <w:ind w:left="312" w:hanging="312"/>
+        <w:rPr>
+          <w:lang w:val="fr-FR"/>
+        </w:rPr>
+      </w:pPr>
+      <w:r>
+        <w:rPr>
+          <w:color w:val="2F3437"/>
+          <w:sz w:val="18"/>
+        </w:rPr>
+        <w:t xml:space="preserve">7. Chen WG, et al. The emerging science of interoception: sensing, integrating, interpreting, and regulating signals within the self. </w:t>
+      </w:r>
+      <w:r>
+        <w:rPr>
+          <w:color w:val="2F3437"/>
+          <w:sz w:val="18"/>
+          <w:lang w:val="fr-FR"/>
+        </w:rPr>
+        <w:t xml:space="preserve">Trends in Neurosciences. </w:t>
+      </w:r>
+      <w:proofErr w:type="gramStart"/>
+      <w:r>
+        <w:rPr>
+          <w:color w:val="2F3437"/>
+          <w:sz w:val="18"/>
+          <w:lang w:val="fr-FR"/>
+        </w:rPr>
+        <w:t>2021;</w:t>
+      </w:r>
+      <w:proofErr w:type="gramEnd"/>
+      <w:r>
+        <w:rPr>
+          <w:color w:val="2F3437"/>
+          <w:sz w:val="18"/>
+          <w:lang w:val="fr-FR"/>
+        </w:rPr>
+        <w:t>44(1</w:t>
+      </w:r>
+      <w:proofErr w:type="gramStart"/>
+      <w:r>
+        <w:rPr>
+          <w:color w:val="2F3437"/>
+          <w:sz w:val="18"/>
+          <w:lang w:val="fr-FR"/>
+        </w:rPr>
+        <w:t>):</w:t>
+      </w:r>
+      <w:proofErr w:type="gramEnd"/>
+      <w:r>
+        <w:rPr>
+          <w:color w:val="2F3437"/>
+          <w:sz w:val="18"/>
+          <w:lang w:val="fr-FR"/>
+        </w:rPr>
+        <w:t xml:space="preserve">3-16. </w:t>
+      </w:r>
+      <w:proofErr w:type="gramStart"/>
+      <w:r>
+        <w:rPr>
+          <w:color w:val="2F3437"/>
+          <w:sz w:val="18"/>
+          <w:lang w:val="fr-FR"/>
+        </w:rPr>
+        <w:t>doi:10.1016/j.tins</w:t>
+      </w:r>
+      <w:proofErr w:type="gramEnd"/>
+      <w:r>
+        <w:rPr>
+          <w:color w:val="2F3437"/>
+          <w:sz w:val="18"/>
+          <w:lang w:val="fr-FR"/>
+        </w:rPr>
+        <w:t>.2020.10.007.</w:t>
+      </w:r>
+    </w:p>
+    <w:p>
+      <w:pPr>
+        <w:pStyle w:val="BodyText"/>
+        <w:spacing w:after="60"/>
+        <w:ind w:left="312" w:hanging="312"/>
+      </w:pPr>
+      <w:r>
+        <w:rPr>
+          <w:color w:val="2F3437"/>
+          <w:sz w:val="18"/>
+          <w:lang w:val="fr-FR"/>
+        </w:rPr>
+        <w:t xml:space="preserve">8. Hopper SI, et al. </w:t>
+      </w:r>
+      <w:r>
+        <w:rPr>
+          <w:color w:val="2F3437"/>
+          <w:sz w:val="18"/>
+        </w:rPr>
+        <w:t>Effectiveness of diaphragmatic breathing for reducing physiological and psychological stress in adults: a quantitative systematic review. JBI Database of Systematic Reviews and Implementation Reports. 2019;17(9):1855-1876. doi:10.11124/JBISRIR-2017-003848.</w:t>
+      </w:r>
+    </w:p>
+    <w:p>
+      <w:pPr>
+        <w:pStyle w:val="BodyText"/>
+        <w:spacing w:after="60"/>
+        <w:ind w:left="312" w:hanging="312"/>
+      </w:pPr>
+      <w:r>
+        <w:rPr>
+          <w:color w:val="2F3437"/>
+          <w:sz w:val="18"/>
+        </w:rPr>
+        <w:t>9. Cannon WB. The Wisdom of the Body. New York: W.W. Norton; 1932.</w:t>
+      </w:r>
+    </w:p>
+    <w:p>
+      <w:pPr>
+        <w:pStyle w:val="BodyText"/>
+        <w:spacing w:after="60"/>
+        <w:ind w:left="312" w:hanging="312"/>
+        <w:rPr>
+          <w:color w:val="2F3437"/>
+          <w:sz w:val="18"/>
+        </w:rPr>
+      </w:pPr>
+      <w:r>
+        <w:rPr>
+          <w:color w:val="2F3437"/>
+          <w:sz w:val="18"/>
+        </w:rPr>
+        <w:t>10. Selye H. The Stress of Life. New York: McGraw-Hill; 1956.</w:t>
+      </w:r>
+    </w:p>
+    <w:p>
+      <w:pPr>
+        <w:pStyle w:val="BodyText"/>
+        <w:spacing w:after="60"/>
+        <w:ind w:left="312" w:hanging="312"/>
+        <w:rPr>
+          <w:color w:val="2F3437"/>
+          <w:sz w:val="18"/>
+        </w:rPr>
+      </w:pPr>
     </w:p>
     <w:p>
       <w:pPr>
@@ -6418,7 +6594,7 @@
                 <w:color w:val="4C5052"/>
                 <w:sz w:val="20"/>
               </w:rPr>
-              <w:t xml:space="preserve">2. </w:t>
+              <w:t>2. M</w:t>
             </w:r>
             <w:proofErr w:type="spellStart"/>
             <w:r>
@@ -6427,7 +6603,7 @@
                 <w:color w:val="4C5052"/>
                 <w:sz w:val="20"/>
               </w:rPr>
-              <w:t>Mobilisation</w:t>
+              <w:t>obilisation</w:t>
             </w:r>
             <w:proofErr w:type="spellEnd"/>
             <w:r>
@@ -6556,7 +6732,7 @@
                 <w:color w:val="4C5052"/>
                 <w:sz w:val="20"/>
               </w:rPr>
-              <w:t xml:space="preserve">3. </w:t>
+              <w:t>3. D</w:t>
             </w:r>
             <w:proofErr w:type="spellStart"/>
             <w:r>
@@ -6565,7 +6741,7 @@
                 <w:color w:val="4C5052"/>
                 <w:sz w:val="20"/>
               </w:rPr>
-              <w:t>Disponibilité</w:t>
+              <w:t>isponibilité</w:t>
             </w:r>
             <w:proofErr w:type="spellEnd"/>
             <w:r>
@@ -6701,7 +6877,7 @@
                 <w:color w:val="4C5052"/>
                 <w:sz w:val="20"/>
               </w:rPr>
-              <w:t xml:space="preserve">4. </w:t>
+              <w:t>4. F</w:t>
             </w:r>
             <w:proofErr w:type="spellStart"/>
             <w:r>
@@ -6710,7 +6886,7 @@
                 <w:color w:val="4C5052"/>
                 <w:sz w:val="20"/>
               </w:rPr>
-              <w:t>Fonctions</w:t>
+              <w:t>onctions</w:t>
             </w:r>
             <w:proofErr w:type="spellEnd"/>
             <w:r>
@@ -7197,6 +7373,208 @@
     </w:lvl>
   </w:abstractNum>
   <w:abstractNum w:abstractNumId="9" w15:restartNumberingAfterBreak="0">
+    <w:nsid w:val="074937BC"/>
+    <w:multiLevelType w:val="hybridMultilevel"/>
+    <w:tmpl w:val="F058E94E"/>
+    <w:lvl w:ilvl="0" w:tplc="040C0001">
+      <w:start w:val="1"/>
+      <w:numFmt w:val="bullet"/>
+      <w:lvlText w:val=""/>
+      <w:lvlJc w:val="left"/>
+      <w:pPr>
+        <w:ind w:left="360" w:hanging="360"/>
+      </w:pPr>
+      <w:rPr>
+        <w:rFonts w:ascii="Symbol" w:hAnsi="Symbol" w:hint="default"/>
+      </w:rPr>
+    </w:lvl>
+    <w:lvl w:ilvl="1" w:tplc="040C0001">
+      <w:start w:val="1"/>
+      <w:numFmt w:val="bullet"/>
+      <w:lvlText w:val=""/>
+      <w:lvlJc w:val="left"/>
+      <w:pPr>
+        <w:ind w:left="1080" w:hanging="360"/>
+      </w:pPr>
+      <w:rPr>
+        <w:rFonts w:ascii="Symbol" w:hAnsi="Symbol" w:hint="default"/>
+      </w:rPr>
+    </w:lvl>
+    <w:lvl w:ilvl="2" w:tplc="040C0005" w:tentative="1">
+      <w:start w:val="1"/>
+      <w:numFmt w:val="bullet"/>
+      <w:lvlText w:val=""/>
+      <w:lvlJc w:val="left"/>
+      <w:pPr>
+        <w:ind w:left="1800" w:hanging="360"/>
+      </w:pPr>
+      <w:rPr>
+        <w:rFonts w:ascii="Wingdings" w:hAnsi="Wingdings" w:hint="default"/>
+      </w:rPr>
+    </w:lvl>
+    <w:lvl w:ilvl="3" w:tplc="040C0001" w:tentative="1">
+      <w:start w:val="1"/>
+      <w:numFmt w:val="bullet"/>
+      <w:lvlText w:val=""/>
+      <w:lvlJc w:val="left"/>
+      <w:pPr>
+        <w:ind w:left="2520" w:hanging="360"/>
+      </w:pPr>
+      <w:rPr>
+        <w:rFonts w:ascii="Symbol" w:hAnsi="Symbol" w:hint="default"/>
+      </w:rPr>
+    </w:lvl>
+    <w:lvl w:ilvl="4" w:tplc="040C0003" w:tentative="1">
+      <w:start w:val="1"/>
+      <w:numFmt w:val="bullet"/>
+      <w:lvlText w:val="o"/>
+      <w:lvlJc w:val="left"/>
+      <w:pPr>
+        <w:ind w:left="3240" w:hanging="360"/>
+      </w:pPr>
+      <w:rPr>
+        <w:rFonts w:ascii="Courier New" w:hAnsi="Courier New" w:cs="Courier New" w:hint="default"/>
+      </w:rPr>
+    </w:lvl>
+    <w:lvl w:ilvl="5" w:tplc="040C0005" w:tentative="1">
+      <w:start w:val="1"/>
+      <w:numFmt w:val="bullet"/>
+      <w:lvlText w:val=""/>
+      <w:lvlJc w:val="left"/>
+      <w:pPr>
+        <w:ind w:left="3960" w:hanging="360"/>
+      </w:pPr>
+      <w:rPr>
+        <w:rFonts w:ascii="Wingdings" w:hAnsi="Wingdings" w:hint="default"/>
+      </w:rPr>
+    </w:lvl>
+    <w:lvl w:ilvl="6" w:tplc="040C0001" w:tentative="1">
+      <w:start w:val="1"/>
+      <w:numFmt w:val="bullet"/>
+      <w:lvlText w:val=""/>
+      <w:lvlJc w:val="left"/>
+      <w:pPr>
+        <w:ind w:left="4680" w:hanging="360"/>
+      </w:pPr>
+      <w:rPr>
+        <w:rFonts w:ascii="Symbol" w:hAnsi="Symbol" w:hint="default"/>
+      </w:rPr>
+    </w:lvl>
+    <w:lvl w:ilvl="7" w:tplc="040C0003" w:tentative="1">
+      <w:start w:val="1"/>
+      <w:numFmt w:val="bullet"/>
+      <w:lvlText w:val="o"/>
+      <w:lvlJc w:val="left"/>
+      <w:pPr>
+        <w:ind w:left="5400" w:hanging="360"/>
+      </w:pPr>
+      <w:rPr>
+        <w:rFonts w:ascii="Courier New" w:hAnsi="Courier New" w:cs="Courier New" w:hint="default"/>
+      </w:rPr>
+    </w:lvl>
+    <w:lvl w:ilvl="8" w:tplc="040C0005" w:tentative="1">
+      <w:start w:val="1"/>
+      <w:numFmt w:val="bullet"/>
+      <w:lvlText w:val=""/>
+      <w:lvlJc w:val="left"/>
+      <w:pPr>
+        <w:ind w:left="6120" w:hanging="360"/>
+      </w:pPr>
+      <w:rPr>
+        <w:rFonts w:ascii="Wingdings" w:hAnsi="Wingdings" w:hint="default"/>
+      </w:rPr>
+    </w:lvl>
+  </w:abstractNum>
+  <w:abstractNum w:abstractNumId="10" w15:restartNumberingAfterBreak="0">
+    <w:nsid w:val="07A74D93"/>
+    <w:multiLevelType w:val="hybridMultilevel"/>
+    <w:tmpl w:val="4A12F5F4"/>
+    <w:lvl w:ilvl="0" w:tplc="261EB2F8">
+      <w:start w:val="2"/>
+      <w:numFmt w:val="decimal"/>
+      <w:lvlText w:val="%1."/>
+      <w:lvlJc w:val="left"/>
+      <w:pPr>
+        <w:ind w:left="1429" w:hanging="360"/>
+      </w:pPr>
+      <w:rPr>
+        <w:rFonts w:hint="default"/>
+      </w:rPr>
+    </w:lvl>
+    <w:lvl w:ilvl="1" w:tplc="040C0019" w:tentative="1">
+      <w:start w:val="1"/>
+      <w:numFmt w:val="lowerLetter"/>
+      <w:lvlText w:val="%2."/>
+      <w:lvlJc w:val="left"/>
+      <w:pPr>
+        <w:ind w:left="2149" w:hanging="360"/>
+      </w:pPr>
+    </w:lvl>
+    <w:lvl w:ilvl="2" w:tplc="040C001B" w:tentative="1">
+      <w:start w:val="1"/>
+      <w:numFmt w:val="lowerRoman"/>
+      <w:lvlText w:val="%3."/>
+      <w:lvlJc w:val="right"/>
+      <w:pPr>
+        <w:ind w:left="2869" w:hanging="180"/>
+      </w:pPr>
+    </w:lvl>
+    <w:lvl w:ilvl="3" w:tplc="040C000F" w:tentative="1">
+      <w:start w:val="1"/>
+      <w:numFmt w:val="decimal"/>
+      <w:lvlText w:val="%4."/>
+      <w:lvlJc w:val="left"/>
+      <w:pPr>
+        <w:ind w:left="3589" w:hanging="360"/>
+      </w:pPr>
+    </w:lvl>
+    <w:lvl w:ilvl="4" w:tplc="040C0019" w:tentative="1">
+      <w:start w:val="1"/>
+      <w:numFmt w:val="lowerLetter"/>
+      <w:lvlText w:val="%5."/>
+      <w:lvlJc w:val="left"/>
+      <w:pPr>
+        <w:ind w:left="4309" w:hanging="360"/>
+      </w:pPr>
+    </w:lvl>
+    <w:lvl w:ilvl="5" w:tplc="040C001B" w:tentative="1">
+      <w:start w:val="1"/>
+      <w:numFmt w:val="lowerRoman"/>
+      <w:lvlText w:val="%6."/>
+      <w:lvlJc w:val="right"/>
+      <w:pPr>
+        <w:ind w:left="5029" w:hanging="180"/>
+      </w:pPr>
+    </w:lvl>
+    <w:lvl w:ilvl="6" w:tplc="040C000F" w:tentative="1">
+      <w:start w:val="1"/>
+      <w:numFmt w:val="decimal"/>
+      <w:lvlText w:val="%7."/>
+      <w:lvlJc w:val="left"/>
+      <w:pPr>
+        <w:ind w:left="5749" w:hanging="360"/>
+      </w:pPr>
+    </w:lvl>
+    <w:lvl w:ilvl="7" w:tplc="040C0019" w:tentative="1">
+      <w:start w:val="1"/>
+      <w:numFmt w:val="lowerLetter"/>
+      <w:lvlText w:val="%8."/>
+      <w:lvlJc w:val="left"/>
+      <w:pPr>
+        <w:ind w:left="6469" w:hanging="360"/>
+      </w:pPr>
+    </w:lvl>
+    <w:lvl w:ilvl="8" w:tplc="040C001B" w:tentative="1">
+      <w:start w:val="1"/>
+      <w:numFmt w:val="lowerRoman"/>
+      <w:lvlText w:val="%9."/>
+      <w:lvlJc w:val="right"/>
+      <w:pPr>
+        <w:ind w:left="7189" w:hanging="180"/>
+      </w:pPr>
+    </w:lvl>
+  </w:abstractNum>
+  <w:abstractNum w:abstractNumId="11" w15:restartNumberingAfterBreak="0">
     <w:nsid w:val="0F6B34A9"/>
     <w:multiLevelType w:val="multilevel"/>
     <w:tmpl w:val="EE469982"/>
@@ -7345,7 +7723,7 @@
       </w:rPr>
     </w:lvl>
   </w:abstractNum>
-  <w:abstractNum w:abstractNumId="10" w15:restartNumberingAfterBreak="0">
+  <w:abstractNum w:abstractNumId="12" w15:restartNumberingAfterBreak="0">
     <w:nsid w:val="18553135"/>
     <w:multiLevelType w:val="multilevel"/>
     <w:tmpl w:val="E264D546"/>
@@ -7494,7 +7872,7 @@
       </w:rPr>
     </w:lvl>
   </w:abstractNum>
-  <w:abstractNum w:abstractNumId="11" w15:restartNumberingAfterBreak="0">
+  <w:abstractNum w:abstractNumId="13" w15:restartNumberingAfterBreak="0">
     <w:nsid w:val="3A13291B"/>
     <w:multiLevelType w:val="multilevel"/>
     <w:tmpl w:val="396C66E2"/>
@@ -7643,7 +8021,120 @@
       </w:rPr>
     </w:lvl>
   </w:abstractNum>
-  <w:abstractNum w:abstractNumId="12" w15:restartNumberingAfterBreak="0">
+  <w:abstractNum w:abstractNumId="14" w15:restartNumberingAfterBreak="0">
+    <w:nsid w:val="4EC35CC4"/>
+    <w:multiLevelType w:val="hybridMultilevel"/>
+    <w:tmpl w:val="D31C7CC8"/>
+    <w:lvl w:ilvl="0" w:tplc="040C0005">
+      <w:start w:val="1"/>
+      <w:numFmt w:val="bullet"/>
+      <w:lvlText w:val=""/>
+      <w:lvlJc w:val="left"/>
+      <w:pPr>
+        <w:ind w:left="1494" w:hanging="360"/>
+      </w:pPr>
+      <w:rPr>
+        <w:rFonts w:ascii="Wingdings" w:hAnsi="Wingdings" w:hint="default"/>
+      </w:rPr>
+    </w:lvl>
+    <w:lvl w:ilvl="1" w:tplc="040C0003" w:tentative="1">
+      <w:start w:val="1"/>
+      <w:numFmt w:val="bullet"/>
+      <w:lvlText w:val="o"/>
+      <w:lvlJc w:val="left"/>
+      <w:pPr>
+        <w:ind w:left="2214" w:hanging="360"/>
+      </w:pPr>
+      <w:rPr>
+        <w:rFonts w:ascii="Courier New" w:hAnsi="Courier New" w:cs="Courier New" w:hint="default"/>
+      </w:rPr>
+    </w:lvl>
+    <w:lvl w:ilvl="2" w:tplc="040C0005" w:tentative="1">
+      <w:start w:val="1"/>
+      <w:numFmt w:val="bullet"/>
+      <w:lvlText w:val=""/>
+      <w:lvlJc w:val="left"/>
+      <w:pPr>
+        <w:ind w:left="2934" w:hanging="360"/>
+      </w:pPr>
+      <w:rPr>
+        <w:rFonts w:ascii="Wingdings" w:hAnsi="Wingdings" w:hint="default"/>
+      </w:rPr>
+    </w:lvl>
+    <w:lvl w:ilvl="3" w:tplc="040C0001" w:tentative="1">
+      <w:start w:val="1"/>
+      <w:numFmt w:val="bullet"/>
+      <w:lvlText w:val=""/>
+      <w:lvlJc w:val="left"/>
+      <w:pPr>
+        <w:ind w:left="3654" w:hanging="360"/>
+      </w:pPr>
+      <w:rPr>
+        <w:rFonts w:ascii="Symbol" w:hAnsi="Symbol" w:hint="default"/>
+      </w:rPr>
+    </w:lvl>
+    <w:lvl w:ilvl="4" w:tplc="040C0003" w:tentative="1">
+      <w:start w:val="1"/>
+      <w:numFmt w:val="bullet"/>
+      <w:lvlText w:val="o"/>
+      <w:lvlJc w:val="left"/>
+      <w:pPr>
+        <w:ind w:left="4374" w:hanging="360"/>
+      </w:pPr>
+      <w:rPr>
+        <w:rFonts w:ascii="Courier New" w:hAnsi="Courier New" w:cs="Courier New" w:hint="default"/>
+      </w:rPr>
+    </w:lvl>
+    <w:lvl w:ilvl="5" w:tplc="040C0005" w:tentative="1">
+      <w:start w:val="1"/>
+      <w:numFmt w:val="bullet"/>
+      <w:lvlText w:val=""/>
+      <w:lvlJc w:val="left"/>
+      <w:pPr>
+        <w:ind w:left="5094" w:hanging="360"/>
+      </w:pPr>
+      <w:rPr>
+        <w:rFonts w:ascii="Wingdings" w:hAnsi="Wingdings" w:hint="default"/>
+      </w:rPr>
+    </w:lvl>
+    <w:lvl w:ilvl="6" w:tplc="040C0001" w:tentative="1">
+      <w:start w:val="1"/>
+      <w:numFmt w:val="bullet"/>
+      <w:lvlText w:val=""/>
+      <w:lvlJc w:val="left"/>
+      <w:pPr>
+        <w:ind w:left="5814" w:hanging="360"/>
+      </w:pPr>
+      <w:rPr>
+        <w:rFonts w:ascii="Symbol" w:hAnsi="Symbol" w:hint="default"/>
+      </w:rPr>
+    </w:lvl>
+    <w:lvl w:ilvl="7" w:tplc="040C0003" w:tentative="1">
+      <w:start w:val="1"/>
+      <w:numFmt w:val="bullet"/>
+      <w:lvlText w:val="o"/>
+      <w:lvlJc w:val="left"/>
+      <w:pPr>
+        <w:ind w:left="6534" w:hanging="360"/>
+      </w:pPr>
+      <w:rPr>
+        <w:rFonts w:ascii="Courier New" w:hAnsi="Courier New" w:cs="Courier New" w:hint="default"/>
+      </w:rPr>
+    </w:lvl>
+    <w:lvl w:ilvl="8" w:tplc="040C0005" w:tentative="1">
+      <w:start w:val="1"/>
+      <w:numFmt w:val="bullet"/>
+      <w:lvlText w:val=""/>
+      <w:lvlJc w:val="left"/>
+      <w:pPr>
+        <w:ind w:left="7254" w:hanging="360"/>
+      </w:pPr>
+      <w:rPr>
+        <w:rFonts w:ascii="Wingdings" w:hAnsi="Wingdings" w:hint="default"/>
+      </w:rPr>
+    </w:lvl>
+  </w:abstractNum>
+  <w:abstractNum w:abstractNumId="15" w15:restartNumberingAfterBreak="0">
     <w:nsid w:val="4EDB6C6E"/>
     <w:multiLevelType w:val="multilevel"/>
     <w:tmpl w:val="F772984C"/>
@@ -7792,7 +8283,7 @@
       </w:rPr>
     </w:lvl>
   </w:abstractNum>
-  <w:abstractNum w:abstractNumId="13" w15:restartNumberingAfterBreak="0">
+  <w:abstractNum w:abstractNumId="16" w15:restartNumberingAfterBreak="0">
     <w:nsid w:val="4F621B74"/>
     <w:multiLevelType w:val="multilevel"/>
     <w:tmpl w:val="AA1C6190"/>
@@ -7941,93 +8432,7 @@
       </w:rPr>
     </w:lvl>
   </w:abstractNum>
-  <w:abstractNum w:abstractNumId="14" w15:restartNumberingAfterBreak="0">
-    <w:nsid w:val="607D5AB3"/>
-    <w:multiLevelType w:val="hybridMultilevel"/>
-    <w:tmpl w:val="8E5A7C36"/>
-    <w:lvl w:ilvl="0" w:tplc="0409000F">
-      <w:start w:val="1"/>
-      <w:numFmt w:val="decimal"/>
-      <w:lvlText w:val="%1."/>
-      <w:lvlJc w:val="left"/>
-      <w:pPr>
-        <w:ind w:left="720" w:hanging="360"/>
-      </w:pPr>
-    </w:lvl>
-    <w:lvl w:ilvl="1" w:tplc="04090019" w:tentative="1">
-      <w:start w:val="1"/>
-      <w:numFmt w:val="lowerLetter"/>
-      <w:lvlText w:val="%2."/>
-      <w:lvlJc w:val="left"/>
-      <w:pPr>
-        <w:ind w:left="1440" w:hanging="360"/>
-      </w:pPr>
-    </w:lvl>
-    <w:lvl w:ilvl="2" w:tplc="0409001B" w:tentative="1">
-      <w:start w:val="1"/>
-      <w:numFmt w:val="lowerRoman"/>
-      <w:lvlText w:val="%3."/>
-      <w:lvlJc w:val="right"/>
-      <w:pPr>
-        <w:ind w:left="2160" w:hanging="180"/>
-      </w:pPr>
-    </w:lvl>
-    <w:lvl w:ilvl="3" w:tplc="0409000F" w:tentative="1">
-      <w:start w:val="1"/>
-      <w:numFmt w:val="decimal"/>
-      <w:lvlText w:val="%4."/>
-      <w:lvlJc w:val="left"/>
-      <w:pPr>
-        <w:ind w:left="2880" w:hanging="360"/>
-      </w:pPr>
-    </w:lvl>
-    <w:lvl w:ilvl="4" w:tplc="04090019" w:tentative="1">
-      <w:start w:val="1"/>
-      <w:numFmt w:val="lowerLetter"/>
-      <w:lvlText w:val="%5."/>
-      <w:lvlJc w:val="left"/>
-      <w:pPr>
-        <w:ind w:left="3600" w:hanging="360"/>
-      </w:pPr>
-    </w:lvl>
-    <w:lvl w:ilvl="5" w:tplc="0409001B" w:tentative="1">
-      <w:start w:val="1"/>
-      <w:numFmt w:val="lowerRoman"/>
-      <w:lvlText w:val="%6."/>
-      <w:lvlJc w:val="right"/>
-      <w:pPr>
-        <w:ind w:left="4320" w:hanging="180"/>
-      </w:pPr>
-    </w:lvl>
-    <w:lvl w:ilvl="6" w:tplc="0409000F" w:tentative="1">
-      <w:start w:val="1"/>
-      <w:numFmt w:val="decimal"/>
-      <w:lvlText w:val="%7."/>
-      <w:lvlJc w:val="left"/>
-      <w:pPr>
-        <w:ind w:left="5040" w:hanging="360"/>
-      </w:pPr>
-    </w:lvl>
-    <w:lvl w:ilvl="7" w:tplc="04090019" w:tentative="1">
-      <w:start w:val="1"/>
-      <w:numFmt w:val="lowerLetter"/>
-      <w:lvlText w:val="%8."/>
-      <w:lvlJc w:val="left"/>
-      <w:pPr>
-        <w:ind w:left="5760" w:hanging="360"/>
-      </w:pPr>
-    </w:lvl>
-    <w:lvl w:ilvl="8" w:tplc="0409001B" w:tentative="1">
-      <w:start w:val="1"/>
-      <w:numFmt w:val="lowerRoman"/>
-      <w:lvlText w:val="%9."/>
-      <w:lvlJc w:val="right"/>
-      <w:pPr>
-        <w:ind w:left="6480" w:hanging="180"/>
-      </w:pPr>
-    </w:lvl>
-  </w:abstractNum>
-  <w:abstractNum w:abstractNumId="15" w15:restartNumberingAfterBreak="0">
+  <w:abstractNum w:abstractNumId="17" w15:restartNumberingAfterBreak="0">
     <w:nsid w:val="646710A7"/>
     <w:multiLevelType w:val="multilevel"/>
     <w:tmpl w:val="316C8862"/>
@@ -8176,7 +8581,7 @@
       </w:rPr>
     </w:lvl>
   </w:abstractNum>
-  <w:abstractNum w:abstractNumId="16" w15:restartNumberingAfterBreak="0">
+  <w:abstractNum w:abstractNumId="18" w15:restartNumberingAfterBreak="0">
     <w:nsid w:val="6BC944BD"/>
     <w:multiLevelType w:val="multilevel"/>
     <w:tmpl w:val="B1E8C22E"/>
@@ -8325,7 +8730,120 @@
       </w:rPr>
     </w:lvl>
   </w:abstractNum>
-  <w:abstractNum w:abstractNumId="17" w15:restartNumberingAfterBreak="0">
+  <w:abstractNum w:abstractNumId="19" w15:restartNumberingAfterBreak="0">
+    <w:nsid w:val="6FE4579D"/>
+    <w:multiLevelType w:val="hybridMultilevel"/>
+    <w:tmpl w:val="B9848F5E"/>
+    <w:lvl w:ilvl="0" w:tplc="040C0003">
+      <w:start w:val="1"/>
+      <w:numFmt w:val="bullet"/>
+      <w:lvlText w:val="o"/>
+      <w:lvlJc w:val="left"/>
+      <w:pPr>
+        <w:ind w:left="1440" w:hanging="360"/>
+      </w:pPr>
+      <w:rPr>
+        <w:rFonts w:ascii="Courier New" w:hAnsi="Courier New" w:cs="Courier New" w:hint="default"/>
+      </w:rPr>
+    </w:lvl>
+    <w:lvl w:ilvl="1" w:tplc="040C0003" w:tentative="1">
+      <w:start w:val="1"/>
+      <w:numFmt w:val="bullet"/>
+      <w:lvlText w:val="o"/>
+      <w:lvlJc w:val="left"/>
+      <w:pPr>
+        <w:ind w:left="2160" w:hanging="360"/>
+      </w:pPr>
+      <w:rPr>
+        <w:rFonts w:ascii="Courier New" w:hAnsi="Courier New" w:cs="Courier New" w:hint="default"/>
+      </w:rPr>
+    </w:lvl>
+    <w:lvl w:ilvl="2" w:tplc="040C0005" w:tentative="1">
+      <w:start w:val="1"/>
+      <w:numFmt w:val="bullet"/>
+      <w:lvlText w:val=""/>
+      <w:lvlJc w:val="left"/>
+      <w:pPr>
+        <w:ind w:left="2880" w:hanging="360"/>
+      </w:pPr>
+      <w:rPr>
+        <w:rFonts w:ascii="Wingdings" w:hAnsi="Wingdings" w:hint="default"/>
+      </w:rPr>
+    </w:lvl>
+    <w:lvl w:ilvl="3" w:tplc="040C0001" w:tentative="1">
+      <w:start w:val="1"/>
+      <w:numFmt w:val="bullet"/>
+      <w:lvlText w:val=""/>
+      <w:lvlJc w:val="left"/>
+      <w:pPr>
+        <w:ind w:left="3600" w:hanging="360"/>
+      </w:pPr>
+      <w:rPr>
+        <w:rFonts w:ascii="Symbol" w:hAnsi="Symbol" w:hint="default"/>
+      </w:rPr>
+    </w:lvl>
+    <w:lvl w:ilvl="4" w:tplc="040C0003" w:tentative="1">
+      <w:start w:val="1"/>
+      <w:numFmt w:val="bullet"/>
+      <w:lvlText w:val="o"/>
+      <w:lvlJc w:val="left"/>
+      <w:pPr>
+        <w:ind w:left="4320" w:hanging="360"/>
+      </w:pPr>
+      <w:rPr>
+        <w:rFonts w:ascii="Courier New" w:hAnsi="Courier New" w:cs="Courier New" w:hint="default"/>
+      </w:rPr>
+    </w:lvl>
+    <w:lvl w:ilvl="5" w:tplc="040C0005" w:tentative="1">
+      <w:start w:val="1"/>
+      <w:numFmt w:val="bullet"/>
+      <w:lvlText w:val=""/>
+      <w:lvlJc w:val="left"/>
+      <w:pPr>
+        <w:ind w:left="5040" w:hanging="360"/>
+      </w:pPr>
+      <w:rPr>
+        <w:rFonts w:ascii="Wingdings" w:hAnsi="Wingdings" w:hint="default"/>
+      </w:rPr>
+    </w:lvl>
+    <w:lvl w:ilvl="6" w:tplc="040C0001" w:tentative="1">
+      <w:start w:val="1"/>
+      <w:numFmt w:val="bullet"/>
+      <w:lvlText w:val=""/>
+      <w:lvlJc w:val="left"/>
+      <w:pPr>
+        <w:ind w:left="5760" w:hanging="360"/>
+      </w:pPr>
+      <w:rPr>
+        <w:rFonts w:ascii="Symbol" w:hAnsi="Symbol" w:hint="default"/>
+      </w:rPr>
+    </w:lvl>
+    <w:lvl w:ilvl="7" w:tplc="040C0003" w:tentative="1">
+      <w:start w:val="1"/>
+      <w:numFmt w:val="bullet"/>
+      <w:lvlText w:val="o"/>
+      <w:lvlJc w:val="left"/>
+      <w:pPr>
+        <w:ind w:left="6480" w:hanging="360"/>
+      </w:pPr>
+      <w:rPr>
+        <w:rFonts w:ascii="Courier New" w:hAnsi="Courier New" w:cs="Courier New" w:hint="default"/>
+      </w:rPr>
+    </w:lvl>
+    <w:lvl w:ilvl="8" w:tplc="040C0005" w:tentative="1">
+      <w:start w:val="1"/>
+      <w:numFmt w:val="bullet"/>
+      <w:lvlText w:val=""/>
+      <w:lvlJc w:val="left"/>
+      <w:pPr>
+        <w:ind w:left="7200" w:hanging="360"/>
+      </w:pPr>
+      <w:rPr>
+        <w:rFonts w:ascii="Wingdings" w:hAnsi="Wingdings" w:hint="default"/>
+      </w:rPr>
+    </w:lvl>
+  </w:abstractNum>
+  <w:abstractNum w:abstractNumId="20" w15:restartNumberingAfterBreak="0">
     <w:nsid w:val="753F4715"/>
     <w:multiLevelType w:val="multilevel"/>
     <w:tmpl w:val="8960BC96"/>
@@ -8502,31 +9020,40 @@
     <w:abstractNumId w:val="0"/>
   </w:num>
   <w:num w:numId="10" w16cid:durableId="797801330">
-    <w:abstractNumId w:val="10"/>
+    <w:abstractNumId w:val="12"/>
   </w:num>
   <w:num w:numId="11" w16cid:durableId="1197936796">
+    <w:abstractNumId w:val="11"/>
+  </w:num>
+  <w:num w:numId="12" w16cid:durableId="1322277151">
+    <w:abstractNumId w:val="17"/>
+  </w:num>
+  <w:num w:numId="13" w16cid:durableId="574629319">
+    <w:abstractNumId w:val="13"/>
+  </w:num>
+  <w:num w:numId="14" w16cid:durableId="491989213">
+    <w:abstractNumId w:val="20"/>
+  </w:num>
+  <w:num w:numId="15" w16cid:durableId="101148653">
+    <w:abstractNumId w:val="15"/>
+  </w:num>
+  <w:num w:numId="16" w16cid:durableId="921723556">
+    <w:abstractNumId w:val="16"/>
+  </w:num>
+  <w:num w:numId="17" w16cid:durableId="2100785731">
+    <w:abstractNumId w:val="18"/>
+  </w:num>
+  <w:num w:numId="18" w16cid:durableId="1889755862">
     <w:abstractNumId w:val="9"/>
   </w:num>
-  <w:num w:numId="12" w16cid:durableId="1322277151">
-    <w:abstractNumId w:val="15"/>
+  <w:num w:numId="19" w16cid:durableId="667826156">
+    <w:abstractNumId w:val="14"/>
   </w:num>
-  <w:num w:numId="13" w16cid:durableId="574629319">
-    <w:abstractNumId w:val="11"/>
+  <w:num w:numId="20" w16cid:durableId="1080518888">
+    <w:abstractNumId w:val="19"/>
   </w:num>
-  <w:num w:numId="14" w16cid:durableId="491989213">
-    <w:abstractNumId w:val="17"/>
-  </w:num>
-  <w:num w:numId="15" w16cid:durableId="101148653">
-    <w:abstractNumId w:val="12"/>
-  </w:num>
-  <w:num w:numId="16" w16cid:durableId="921723556">
-    <w:abstractNumId w:val="13"/>
-  </w:num>
-  <w:num w:numId="17" w16cid:durableId="2100785731">
-    <w:abstractNumId w:val="16"/>
-  </w:num>
-  <w:num w:numId="18" w16cid:durableId="1656953289">
-    <w:abstractNumId w:val="14"/>
+  <w:num w:numId="21" w16cid:durableId="1911957453">
+    <w:abstractNumId w:val="10"/>
   </w:num>
 </w:numbering>
 </file>
@@ -9142,6 +9669,7 @@
   <w:style w:type="character" w:default="1" w:styleId="DefaultParagraphFont">
     <w:name w:val="Default Paragraph Font"/>
     <w:uiPriority w:val="1"/>
+    <w:semiHidden/>
     <w:unhideWhenUsed/>
   </w:style>
   <w:style w:type="table" w:default="1" w:styleId="TableNormal">

</xml_diff>